<commit_message>
Add exercise 4 (join row inflation) and update student guide
- Add data/sites_duplicate.csv: pre-built broken sites table with a
  duplicate recorder_id row (AM02 with two habitats) for exercise 4
- Add exercise 4 to GUIA_ALUMNO: demonstrates how a many-to-many join
  silently inflates rows from 5 to 7 and how the consolidate() guardrail
  catches it
- Add matching entry to troubleshooting table (Cuadro 2)
- Regenerate GUIA_ALUMNO.docx from updated markdown
- Update .gitignore to track data/sites_duplicate.csv
</commit_message>
<xml_diff>
--- a/GUIA_ALUMNO.docx
+++ b/GUIA_ALUMNO.docx
@@ -34,46 +34,11 @@
         <w:t xml:space="preserve">Reunión REIE · 26 de junio de 2026</w:t>
       </w:r>
     </w:p>
-    <w:sdt>
-      <w:sdtPr>
-        <w:docPartObj>
-          <w:docPartGallery w:val="Table of Contents"/>
-          <w:docPartUnique/>
-        </w:docPartObj>
-      </w:sdtPr>
-      <w:sdtContent>
-        <w:p>
-          <w:pPr>
-            <w:pStyle w:val="TOCHeading"/>
-          </w:pPr>
-          <w:r>
-            <w:t xml:space="preserve">Table of Contents</w:t>
-          </w:r>
-        </w:p>
-        <w:p>
-          <w:r>
-            <w:fldChar w:fldCharType="begin" w:dirty="true"/>
-            <w:instrText xml:space="preserve">TOC \o "1-2" \h \z \u</w:instrText>
-            <w:fldChar w:fldCharType="separate"/>
-            <w:fldChar w:fldCharType="end"/>
-          </w:r>
-        </w:p>
-      </w:sdtContent>
-    </w:sdt>
     <w:bookmarkStart w:id="9" w:name="presentación-y-objetivos"/>
     <w:p>
       <w:pPr>
         <w:pStyle w:val="Heading1"/>
       </w:pPr>
-      <w:r>
-        <w:rPr>
-          <w:rStyle w:val="SectionNumber"/>
-        </w:rPr>
-        <w:t xml:space="preserve">1</w:t>
-      </w:r>
-      <w:r>
-        <w:tab/>
-      </w:r>
       <w:r>
         <w:t xml:space="preserve">Presentación y objetivos</w:t>
       </w:r>
@@ -341,15 +306,6 @@
       <w:pPr>
         <w:pStyle w:val="Heading1"/>
       </w:pPr>
-      <w:r>
-        <w:rPr>
-          <w:rStyle w:val="SectionNumber"/>
-        </w:rPr>
-        <w:t xml:space="preserve">2</w:t>
-      </w:r>
-      <w:r>
-        <w:tab/>
-      </w:r>
       <w:r>
         <w:t xml:space="preserve">Obtención de los materiales</w:t>
       </w:r>
@@ -408,15 +364,6 @@
         <w:pStyle w:val="Heading2"/>
       </w:pPr>
       <w:r>
-        <w:rPr>
-          <w:rStyle w:val="SectionNumber"/>
-        </w:rPr>
-        <w:t xml:space="preserve">2.1</w:t>
-      </w:r>
-      <w:r>
-        <w:tab/>
-      </w:r>
-      <w:r>
         <w:t xml:space="preserve">Opción A — Descarga directa en formato ZIP (recomendada)</w:t>
       </w:r>
     </w:p>
@@ -611,15 +558,6 @@
         <w:pStyle w:val="Heading2"/>
       </w:pPr>
       <w:r>
-        <w:rPr>
-          <w:rStyle w:val="SectionNumber"/>
-        </w:rPr>
-        <w:t xml:space="preserve">2.2</w:t>
-      </w:r>
-      <w:r>
-        <w:tab/>
-      </w:r>
-      <w:r>
         <w:t xml:space="preserve">Opción B — Clonado con Git</w:t>
       </w:r>
     </w:p>
@@ -679,15 +617,6 @@
         <w:pStyle w:val="Heading1"/>
       </w:pPr>
       <w:r>
-        <w:rPr>
-          <w:rStyle w:val="SectionNumber"/>
-        </w:rPr>
-        <w:t xml:space="preserve">3</w:t>
-      </w:r>
-      <w:r>
-        <w:tab/>
-      </w:r>
-      <w:r>
         <w:t xml:space="preserve">Instalación del entorno</w:t>
       </w:r>
     </w:p>
@@ -716,15 +645,6 @@
       <w:pPr>
         <w:pStyle w:val="Heading2"/>
       </w:pPr>
-      <w:r>
-        <w:rPr>
-          <w:rStyle w:val="SectionNumber"/>
-        </w:rPr>
-        <w:t xml:space="preserve">3.1</w:t>
-      </w:r>
-      <w:r>
-        <w:tab/>
-      </w:r>
       <w:r>
         <w:t xml:space="preserve">Paso 1 — Instalación de R</w:t>
       </w:r>
@@ -877,15 +797,6 @@
         <w:pStyle w:val="Heading2"/>
       </w:pPr>
       <w:r>
-        <w:rPr>
-          <w:rStyle w:val="SectionNumber"/>
-        </w:rPr>
-        <w:t xml:space="preserve">3.2</w:t>
-      </w:r>
-      <w:r>
-        <w:tab/>
-      </w:r>
-      <w:r>
         <w:t xml:space="preserve">Paso 2 — Instalación de RStudio</w:t>
       </w:r>
     </w:p>
@@ -968,15 +879,6 @@
         <w:pStyle w:val="Heading2"/>
       </w:pPr>
       <w:r>
-        <w:rPr>
-          <w:rStyle w:val="SectionNumber"/>
-        </w:rPr>
-        <w:t xml:space="preserve">3.3</w:t>
-      </w:r>
-      <w:r>
-        <w:tab/>
-      </w:r>
-      <w:r>
         <w:t xml:space="preserve">Paso 3 — Primer arranque de RStudio</w:t>
       </w:r>
     </w:p>
@@ -1038,15 +940,6 @@
       <w:pPr>
         <w:pStyle w:val="Heading2"/>
       </w:pPr>
-      <w:r>
-        <w:rPr>
-          <w:rStyle w:val="SectionNumber"/>
-        </w:rPr>
-        <w:t xml:space="preserve">3.4</w:t>
-      </w:r>
-      <w:r>
-        <w:tab/>
-      </w:r>
       <w:r>
         <w:t xml:space="preserve">Paso 4 — Instalación de los paquetes de R</w:t>
       </w:r>
@@ -1479,15 +1372,6 @@
         <w:pStyle w:val="Heading1"/>
       </w:pPr>
       <w:r>
-        <w:rPr>
-          <w:rStyle w:val="SectionNumber"/>
-        </w:rPr>
-        <w:t xml:space="preserve">4</w:t>
-      </w:r>
-      <w:r>
-        <w:tab/>
-      </w:r>
-      <w:r>
         <w:t xml:space="preserve">Puesta en marcha</w:t>
       </w:r>
     </w:p>
@@ -1730,21 +1614,12 @@
       </w:r>
     </w:p>
     <w:bookmarkEnd w:id="21"/>
-    <w:bookmarkStart w:id="25" w:name="procedimiento-ejercicios-guiados"/>
+    <w:bookmarkStart w:id="26" w:name="procedimiento-ejercicios-guiados"/>
     <w:p>
       <w:pPr>
         <w:pStyle w:val="Heading1"/>
       </w:pPr>
       <w:r>
-        <w:rPr>
-          <w:rStyle w:val="SectionNumber"/>
-        </w:rPr>
-        <w:t xml:space="preserve">5</w:t>
-      </w:r>
-      <w:r>
-        <w:tab/>
-      </w:r>
-      <w:r>
         <w:t xml:space="preserve">Procedimiento: ejercicios guiados</w:t>
       </w:r>
     </w:p>
@@ -1773,15 +1648,6 @@
       <w:pPr>
         <w:pStyle w:val="Heading2"/>
       </w:pPr>
-      <w:r>
-        <w:rPr>
-          <w:rStyle w:val="SectionNumber"/>
-        </w:rPr>
-        <w:t xml:space="preserve">5.1</w:t>
-      </w:r>
-      <w:r>
-        <w:tab/>
-      </w:r>
       <w:r>
         <w:t xml:space="preserve">Ejercicio 1. Ejecución del flujo y examen de la tabla resultante</w:t>
       </w:r>
@@ -2124,15 +1990,6 @@
       <w:pPr>
         <w:pStyle w:val="Heading2"/>
       </w:pPr>
-      <w:r>
-        <w:rPr>
-          <w:rStyle w:val="SectionNumber"/>
-        </w:rPr>
-        <w:t xml:space="preserve">5.2</w:t>
-      </w:r>
-      <w:r>
-        <w:tab/>
-      </w:r>
       <w:r>
         <w:t xml:space="preserve">Ejercicio 2. Alteración de la zona horaria y detección de discrepancias</w:t>
       </w:r>
@@ -2485,15 +2342,6 @@
         <w:pStyle w:val="Heading2"/>
       </w:pPr>
       <w:r>
-        <w:rPr>
-          <w:rStyle w:val="SectionNumber"/>
-        </w:rPr>
-        <w:t xml:space="preserve">5.3</w:t>
-      </w:r>
-      <w:r>
-        <w:tab/>
-      </w:r>
-      <w:r>
         <w:t xml:space="preserve">Ejercicio 3. Modificación de un umbral de control de calidad</w:t>
       </w:r>
     </w:p>
@@ -2895,21 +2743,576 @@
       </w:r>
     </w:p>
     <w:bookmarkEnd w:id="24"/>
+    <w:bookmarkStart w:id="25" w:name="Xb696544ac4403e7bdbec7a7c1e5b8e030a07e5f"/>
+    <w:p>
+      <w:pPr>
+        <w:pStyle w:val="Heading2"/>
+      </w:pPr>
+      <w:r>
+        <w:t xml:space="preserve">Ejercicio 4. Un join que infla filas silenciosamente</w:t>
+      </w:r>
+    </w:p>
+    <w:p>
+      <w:pPr>
+        <w:pStyle w:val="FirstParagraph"/>
+      </w:pPr>
+      <w:r>
+        <w:t xml:space="preserve">La unión de la tabla de resultados con el diseño de muestreo es el punto donde</w:t>
+      </w:r>
+      <w:r>
+        <w:t xml:space="preserve"> </w:t>
+      </w:r>
+      <w:r>
+        <w:t xml:space="preserve">con más frecuencia se introducen errores difíciles de detectar. Si la tabla de</w:t>
+      </w:r>
+      <w:r>
+        <w:t xml:space="preserve"> </w:t>
+      </w:r>
+      <w:r>
+        <w:t xml:space="preserve">emplazamientos contiene dos filas para el mismo grabador —por ejemplo, por una</w:t>
+      </w:r>
+      <w:r>
+        <w:t xml:space="preserve"> </w:t>
+      </w:r>
+      <w:r>
+        <w:t xml:space="preserve">doble clasificación de hábitat o una fila duplicada accidental—, cada grabación de</w:t>
+      </w:r>
+      <w:r>
+        <w:t xml:space="preserve"> </w:t>
+      </w:r>
+      <w:r>
+        <w:t xml:space="preserve">ese grabador se multiplica en la tabla final sin ningún mensaje de error explícito</w:t>
+      </w:r>
+      <w:r>
+        <w:t xml:space="preserve"> </w:t>
+      </w:r>
+      <w:r>
+        <w:t xml:space="preserve">de R. El flujo incluye un guardarraíl que detecta este caso concreto.</w:t>
+      </w:r>
+    </w:p>
+    <w:p>
+      <w:pPr>
+        <w:pStyle w:val="BodyText"/>
+      </w:pPr>
+      <w:r>
+        <w:rPr>
+          <w:b/>
+          <w:bCs/>
+        </w:rPr>
+        <w:t xml:space="preserve">Procedimiento.</w:t>
+      </w:r>
+    </w:p>
+    <w:p>
+      <w:pPr>
+        <w:pStyle w:val="Compact"/>
+        <w:numPr>
+          <w:ilvl w:val="0"/>
+          <w:numId w:val="1009"/>
+        </w:numPr>
+      </w:pPr>
+      <w:r>
+        <w:t xml:space="preserve">Ábrase el archivo</w:t>
+      </w:r>
+      <w:r>
+        <w:t xml:space="preserve"> </w:t>
+      </w:r>
+      <w:r>
+        <w:rPr>
+          <w:rStyle w:val="VerbatimChar"/>
+        </w:rPr>
+        <w:t xml:space="preserve">_targets.R</w:t>
+      </w:r>
+      <w:r>
+        <w:t xml:space="preserve"> </w:t>
+      </w:r>
+      <w:r>
+        <w:t xml:space="preserve">y localícese la línea:</w:t>
+      </w:r>
+    </w:p>
+    <w:p>
+      <w:pPr>
+        <w:pStyle w:val="SourceCode"/>
+      </w:pPr>
+      <w:r>
+        <w:rPr>
+          <w:rStyle w:val="FunctionTok"/>
+        </w:rPr>
+        <w:t xml:space="preserve">tar_target</w:t>
+      </w:r>
+      <w:r>
+        <w:rPr>
+          <w:rStyle w:val="NormalTok"/>
+        </w:rPr>
+        <w:t xml:space="preserve">(sites_file, </w:t>
+      </w:r>
+      <w:r>
+        <w:rPr>
+          <w:rStyle w:val="StringTok"/>
+        </w:rPr>
+        <w:t xml:space="preserve">"data/sites.csv"</w:t>
+      </w:r>
+      <w:r>
+        <w:rPr>
+          <w:rStyle w:val="NormalTok"/>
+        </w:rPr>
+        <w:t xml:space="preserve">, </w:t>
+      </w:r>
+      <w:r>
+        <w:rPr>
+          <w:rStyle w:val="AttributeTok"/>
+        </w:rPr>
+        <w:t xml:space="preserve">format =</w:t>
+      </w:r>
+      <w:r>
+        <w:rPr>
+          <w:rStyle w:val="NormalTok"/>
+        </w:rPr>
+        <w:t xml:space="preserve"> </w:t>
+      </w:r>
+      <w:r>
+        <w:rPr>
+          <w:rStyle w:val="StringTok"/>
+        </w:rPr>
+        <w:t xml:space="preserve">"file"</w:t>
+      </w:r>
+      <w:r>
+        <w:rPr>
+          <w:rStyle w:val="NormalTok"/>
+        </w:rPr>
+        <w:t xml:space="preserve">),</w:t>
+      </w:r>
+    </w:p>
+    <w:p>
+      <w:pPr>
+        <w:pStyle w:val="Compact"/>
+        <w:numPr>
+          <w:ilvl w:val="0"/>
+          <w:numId w:val="1010"/>
+        </w:numPr>
+      </w:pPr>
+      <w:r>
+        <w:t xml:space="preserve">Sustitúyase</w:t>
+      </w:r>
+      <w:r>
+        <w:t xml:space="preserve"> </w:t>
+      </w:r>
+      <w:r>
+        <w:rPr>
+          <w:rStyle w:val="VerbatimChar"/>
+        </w:rPr>
+        <w:t xml:space="preserve">sites.csv</w:t>
+      </w:r>
+      <w:r>
+        <w:t xml:space="preserve"> </w:t>
+      </w:r>
+      <w:r>
+        <w:t xml:space="preserve">por</w:t>
+      </w:r>
+      <w:r>
+        <w:t xml:space="preserve"> </w:t>
+      </w:r>
+      <w:r>
+        <w:rPr>
+          <w:rStyle w:val="VerbatimChar"/>
+        </w:rPr>
+        <w:t xml:space="preserve">sites_duplicate.csv</w:t>
+      </w:r>
+      <w:r>
+        <w:t xml:space="preserve">:</w:t>
+      </w:r>
+    </w:p>
+    <w:p>
+      <w:pPr>
+        <w:pStyle w:val="SourceCode"/>
+      </w:pPr>
+      <w:r>
+        <w:rPr>
+          <w:rStyle w:val="FunctionTok"/>
+        </w:rPr>
+        <w:t xml:space="preserve">tar_target</w:t>
+      </w:r>
+      <w:r>
+        <w:rPr>
+          <w:rStyle w:val="NormalTok"/>
+        </w:rPr>
+        <w:t xml:space="preserve">(sites_file, </w:t>
+      </w:r>
+      <w:r>
+        <w:rPr>
+          <w:rStyle w:val="StringTok"/>
+        </w:rPr>
+        <w:t xml:space="preserve">"data/sites_duplicate.csv"</w:t>
+      </w:r>
+      <w:r>
+        <w:rPr>
+          <w:rStyle w:val="NormalTok"/>
+        </w:rPr>
+        <w:t xml:space="preserve">, </w:t>
+      </w:r>
+      <w:r>
+        <w:rPr>
+          <w:rStyle w:val="AttributeTok"/>
+        </w:rPr>
+        <w:t xml:space="preserve">format =</w:t>
+      </w:r>
+      <w:r>
+        <w:rPr>
+          <w:rStyle w:val="NormalTok"/>
+        </w:rPr>
+        <w:t xml:space="preserve"> </w:t>
+      </w:r>
+      <w:r>
+        <w:rPr>
+          <w:rStyle w:val="StringTok"/>
+        </w:rPr>
+        <w:t xml:space="preserve">"file"</w:t>
+      </w:r>
+      <w:r>
+        <w:rPr>
+          <w:rStyle w:val="NormalTok"/>
+        </w:rPr>
+        <w:t xml:space="preserve">),</w:t>
+      </w:r>
+    </w:p>
+    <w:p>
+      <w:pPr>
+        <w:pStyle w:val="Compact"/>
+        <w:numPr>
+          <w:ilvl w:val="0"/>
+          <w:numId w:val="1011"/>
+        </w:numPr>
+      </w:pPr>
+      <w:r>
+        <w:t xml:space="preserve">Guárdese el archivo y ejecútese</w:t>
+      </w:r>
+      <w:r>
+        <w:t xml:space="preserve"> </w:t>
+      </w:r>
+      <w:r>
+        <w:rPr>
+          <w:rStyle w:val="VerbatimChar"/>
+        </w:rPr>
+        <w:t xml:space="preserve">targets::tar_make()</w:t>
+      </w:r>
+      <w:r>
+        <w:t xml:space="preserve">.</w:t>
+      </w:r>
+    </w:p>
+    <w:p>
+      <w:pPr>
+        <w:pStyle w:val="FirstParagraph"/>
+      </w:pPr>
+      <w:r>
+        <w:rPr>
+          <w:b/>
+          <w:bCs/>
+        </w:rPr>
+        <w:t xml:space="preserve">Resultados esperados.</w:t>
+      </w:r>
+      <w:r>
+        <w:t xml:space="preserve"> </w:t>
+      </w:r>
+      <w:r>
+        <w:t xml:space="preserve">En la consola aparecen dos avisos. El primero, de</w:t>
+      </w:r>
+      <w:r>
+        <w:t xml:space="preserve"> </w:t>
+      </w:r>
+      <w:r>
+        <w:rPr>
+          <w:rStyle w:val="VerbatimChar"/>
+        </w:rPr>
+        <w:t xml:space="preserve">dplyr</w:t>
+      </w:r>
+      <w:r>
+        <w:t xml:space="preserve">, indica que se ha detectado una relación muchos a muchos entre las tablas</w:t>
+      </w:r>
+      <w:r>
+        <w:t xml:space="preserve"> </w:t>
+      </w:r>
+      <w:r>
+        <w:t xml:space="preserve">(</w:t>
+      </w:r>
+      <w:r>
+        <w:rPr>
+          <w:rStyle w:val="VerbatimChar"/>
+        </w:rPr>
+        <w:t xml:space="preserve">many-to-many relationship</w:t>
+      </w:r>
+      <w:r>
+        <w:t xml:space="preserve">). El segundo, del propio flujo, dice:</w:t>
+      </w:r>
+    </w:p>
+    <w:p>
+      <w:pPr>
+        <w:pStyle w:val="SourceCode"/>
+      </w:pPr>
+      <w:r>
+        <w:rPr>
+          <w:rStyle w:val="VerbatimChar"/>
+        </w:rPr>
+        <w:t xml:space="preserve">El join cambió el nº de filas (5 -&gt; 7). Revisa claves duplicadas en 'sites' o 'meta'.</w:t>
+      </w:r>
+    </w:p>
+    <w:p>
+      <w:pPr>
+        <w:pStyle w:val="FirstParagraph"/>
+      </w:pPr>
+      <w:r>
+        <w:t xml:space="preserve">La tabla resultante tiene siete filas en lugar de cinco: las dos grabaciones del</w:t>
+      </w:r>
+      <w:r>
+        <w:t xml:space="preserve"> </w:t>
+      </w:r>
+      <w:r>
+        <w:t xml:space="preserve">grabador AM02 aparecen duplicadas, cada una con un hábitat distinto (</w:t>
+      </w:r>
+      <w:r>
+        <w:rPr>
+          <w:rStyle w:val="VerbatimChar"/>
+        </w:rPr>
+        <w:t xml:space="preserve">matorral</w:t>
+      </w:r>
+      <w:r>
+        <w:t xml:space="preserve"> </w:t>
+      </w:r>
+      <w:r>
+        <w:t xml:space="preserve">y</w:t>
+      </w:r>
+      <w:r>
+        <w:t xml:space="preserve"> </w:t>
+      </w:r>
+      <w:r>
+        <w:rPr>
+          <w:rStyle w:val="VerbatimChar"/>
+        </w:rPr>
+        <w:t xml:space="preserve">pastizal</w:t>
+      </w:r>
+      <w:r>
+        <w:t xml:space="preserve">). El error es difícil de detectar a simple vista porque los índices</w:t>
+      </w:r>
+      <w:r>
+        <w:t xml:space="preserve"> </w:t>
+      </w:r>
+      <w:r>
+        <w:t xml:space="preserve">acústicos y las fechas son correctos; solo el número de filas delata el problema.</w:t>
+      </w:r>
+    </w:p>
+    <w:p>
+      <w:pPr>
+        <w:pStyle w:val="BodyText"/>
+      </w:pPr>
+      <w:r>
+        <w:t xml:space="preserve">Para confirmar, examínese la tabla:</w:t>
+      </w:r>
+    </w:p>
+    <w:p>
+      <w:pPr>
+        <w:pStyle w:val="SourceCode"/>
+      </w:pPr>
+      <w:r>
+        <w:rPr>
+          <w:rStyle w:val="NormalTok"/>
+        </w:rPr>
+        <w:t xml:space="preserve">tabla </w:t>
+      </w:r>
+      <w:r>
+        <w:rPr>
+          <w:rStyle w:val="OtherTok"/>
+        </w:rPr>
+        <w:t xml:space="preserve">&lt;-</w:t>
+      </w:r>
+      <w:r>
+        <w:rPr>
+          <w:rStyle w:val="NormalTok"/>
+        </w:rPr>
+        <w:t xml:space="preserve"> </w:t>
+      </w:r>
+      <w:r>
+        <w:rPr>
+          <w:rStyle w:val="FunctionTok"/>
+        </w:rPr>
+        <w:t xml:space="preserve">read.csv</w:t>
+      </w:r>
+      <w:r>
+        <w:rPr>
+          <w:rStyle w:val="NormalTok"/>
+        </w:rPr>
+        <w:t xml:space="preserve">(</w:t>
+      </w:r>
+      <w:r>
+        <w:rPr>
+          <w:rStyle w:val="StringTok"/>
+        </w:rPr>
+        <w:t xml:space="preserve">"output/tabla_analisis.csv"</w:t>
+      </w:r>
+      <w:r>
+        <w:rPr>
+          <w:rStyle w:val="NormalTok"/>
+        </w:rPr>
+        <w:t xml:space="preserve">)</w:t>
+      </w:r>
+      <w:r>
+        <w:br/>
+      </w:r>
+      <w:r>
+        <w:rPr>
+          <w:rStyle w:val="FunctionTok"/>
+        </w:rPr>
+        <w:t xml:space="preserve">View</w:t>
+      </w:r>
+      <w:r>
+        <w:rPr>
+          <w:rStyle w:val="NormalTok"/>
+        </w:rPr>
+        <w:t xml:space="preserve">(tabla)</w:t>
+      </w:r>
+      <w:r>
+        <w:br/>
+      </w:r>
+      <w:r>
+        <w:rPr>
+          <w:rStyle w:val="FunctionTok"/>
+        </w:rPr>
+        <w:t xml:space="preserve">nrow</w:t>
+      </w:r>
+      <w:r>
+        <w:rPr>
+          <w:rStyle w:val="NormalTok"/>
+        </w:rPr>
+        <w:t xml:space="preserve">(tabla)   </w:t>
+      </w:r>
+      <w:r>
+        <w:rPr>
+          <w:rStyle w:val="CommentTok"/>
+        </w:rPr>
+        <w:t xml:space="preserve"># debe devolver 7, no 5</w:t>
+      </w:r>
+    </w:p>
+    <w:p>
+      <w:pPr>
+        <w:pStyle w:val="FirstParagraph"/>
+      </w:pPr>
+      <w:r>
+        <w:rPr>
+          <w:b/>
+          <w:bCs/>
+        </w:rPr>
+        <w:t xml:space="preserve">Discusión.</w:t>
+      </w:r>
+      <w:r>
+        <w:t xml:space="preserve"> </w:t>
+      </w:r>
+      <w:r>
+        <w:t xml:space="preserve">Este tipo de error es habitual cuando el diseño de muestreo se</w:t>
+      </w:r>
+      <w:r>
+        <w:t xml:space="preserve"> </w:t>
+      </w:r>
+      <w:r>
+        <w:t xml:space="preserve">construye a partir de varias fuentes o cuando dos personas rellenan la misma</w:t>
+      </w:r>
+      <w:r>
+        <w:t xml:space="preserve"> </w:t>
+      </w:r>
+      <w:r>
+        <w:t xml:space="preserve">hoja por separado. La multiplicación de filas infla el tamaño aparente del</w:t>
+      </w:r>
+      <w:r>
+        <w:t xml:space="preserve"> </w:t>
+      </w:r>
+      <w:r>
+        <w:t xml:space="preserve">conjunto de datos y, dependiendo del análisis posterior, puede sesgar los</w:t>
+      </w:r>
+      <w:r>
+        <w:t xml:space="preserve"> </w:t>
+      </w:r>
+      <w:r>
+        <w:t xml:space="preserve">resultados sin producir ningún error explícito. El guardarraíl de</w:t>
+      </w:r>
+      <w:r>
+        <w:t xml:space="preserve"> </w:t>
+      </w:r>
+      <w:r>
+        <w:rPr>
+          <w:rStyle w:val="VerbatimChar"/>
+        </w:rPr>
+        <w:t xml:space="preserve">consolidate()</w:t>
+      </w:r>
+      <w:r>
+        <w:t xml:space="preserve"> </w:t>
+      </w:r>
+      <w:r>
+        <w:t xml:space="preserve">detiene el problema antes de que llegue al análisis; la solución es identificar</w:t>
+      </w:r>
+      <w:r>
+        <w:t xml:space="preserve"> </w:t>
+      </w:r>
+      <w:r>
+        <w:t xml:space="preserve">y eliminar la fila duplicada en</w:t>
+      </w:r>
+      <w:r>
+        <w:t xml:space="preserve"> </w:t>
+      </w:r>
+      <w:r>
+        <w:rPr>
+          <w:rStyle w:val="VerbatimChar"/>
+        </w:rPr>
+        <w:t xml:space="preserve">data/sites_duplicate.csv</w:t>
+      </w:r>
+      <w:r>
+        <w:t xml:space="preserve">.</w:t>
+      </w:r>
+    </w:p>
+    <w:p>
+      <w:pPr>
+        <w:pStyle w:val="BodyText"/>
+      </w:pPr>
+      <w:r>
+        <w:rPr>
+          <w:i/>
+          <w:iCs/>
+        </w:rPr>
+        <w:t xml:space="preserve">Restauración.</w:t>
+      </w:r>
+      <w:r>
+        <w:t xml:space="preserve"> </w:t>
+      </w:r>
+      <w:r>
+        <w:t xml:space="preserve">Devuélvase</w:t>
+      </w:r>
+      <w:r>
+        <w:t xml:space="preserve"> </w:t>
+      </w:r>
+      <w:r>
+        <w:rPr>
+          <w:rStyle w:val="VerbatimChar"/>
+        </w:rPr>
+        <w:t xml:space="preserve">"data/sites.csv"</w:t>
+      </w:r>
+      <w:r>
+        <w:t xml:space="preserve">, guárdese y ejecútese</w:t>
+      </w:r>
+      <w:r>
+        <w:t xml:space="preserve"> </w:t>
+      </w:r>
+      <w:r>
+        <w:rPr>
+          <w:rStyle w:val="VerbatimChar"/>
+        </w:rPr>
+        <w:t xml:space="preserve">targets::tar_make()</w:t>
+      </w:r>
+      <w:r>
+        <w:t xml:space="preserve">; la tabla debe volver a cinco filas.</w:t>
+      </w:r>
+    </w:p>
     <w:bookmarkEnd w:id="25"/>
-    <w:bookmarkStart w:id="26" w:name="resolución-de-problemas-frecuentes"/>
+    <w:bookmarkEnd w:id="26"/>
+    <w:bookmarkStart w:id="27" w:name="resolución-de-problemas-frecuentes"/>
     <w:p>
       <w:pPr>
         <w:pStyle w:val="Heading1"/>
       </w:pPr>
-      <w:r>
-        <w:rPr>
-          <w:rStyle w:val="SectionNumber"/>
-        </w:rPr>
-        <w:t xml:space="preserve">6</w:t>
-      </w:r>
-      <w:r>
-        <w:tab/>
-      </w:r>
       <w:r>
         <w:t xml:space="preserve">Resolución de problemas frecuentes</w:t>
       </w:r>
@@ -3243,22 +3646,7 @@
               <w:pStyle w:val="Compact"/>
             </w:pPr>
             <w:r>
-              <w:t xml:space="preserve">Error de</w:t>
-            </w:r>
-            <w:r>
-              <w:t xml:space="preserve"> </w:t>
-            </w:r>
-            <w:r>
-              <w:rPr>
-                <w:rStyle w:val="VerbatimChar"/>
-              </w:rPr>
-              <w:t xml:space="preserve">callr</w:t>
-            </w:r>
-            <w:r>
-              <w:t xml:space="preserve"> </w:t>
-            </w:r>
-            <w:r>
-              <w:t xml:space="preserve">o «nombre de archivo demasiado largo» (Windows con OneDrive)</w:t>
+              <w:t xml:space="preserve">La tabla tiene más filas de las esperadas</w:t>
             </w:r>
           </w:p>
         </w:tc>
@@ -3269,7 +3657,16 @@
               <w:pStyle w:val="Compact"/>
             </w:pPr>
             <w:r>
-              <w:t xml:space="preserve">Ruta de usuario con caracteres especiales</w:t>
+              <w:t xml:space="preserve">Clave duplicada en</w:t>
+            </w:r>
+            <w:r>
+              <w:t xml:space="preserve"> </w:t>
+            </w:r>
+            <w:r>
+              <w:rPr>
+                <w:rStyle w:val="VerbatimChar"/>
+              </w:rPr>
+              <w:t xml:space="preserve">sites.csv</w:t>
             </w:r>
           </w:p>
         </w:tc>
@@ -3280,6 +3677,71 @@
               <w:pStyle w:val="Compact"/>
             </w:pPr>
             <w:r>
+              <w:t xml:space="preserve">Identificar la fila duplicada con</w:t>
+            </w:r>
+            <w:r>
+              <w:t xml:space="preserve"> </w:t>
+            </w:r>
+            <w:r>
+              <w:rPr>
+                <w:rStyle w:val="VerbatimChar"/>
+              </w:rPr>
+              <w:t xml:space="preserve">sites[duplicated(sites$recorder_id), ]</w:t>
+            </w:r>
+            <w:r>
+              <w:t xml:space="preserve"> </w:t>
+            </w:r>
+            <w:r>
+              <w:t xml:space="preserve">y eliminarla</w:t>
+            </w:r>
+          </w:p>
+        </w:tc>
+      </w:tr>
+      <w:tr>
+        <w:tc>
+          <w:tcPr/>
+          <w:p>
+            <w:pPr>
+              <w:pStyle w:val="Compact"/>
+            </w:pPr>
+            <w:r>
+              <w:t xml:space="preserve">Error de</w:t>
+            </w:r>
+            <w:r>
+              <w:t xml:space="preserve"> </w:t>
+            </w:r>
+            <w:r>
+              <w:rPr>
+                <w:rStyle w:val="VerbatimChar"/>
+              </w:rPr>
+              <w:t xml:space="preserve">callr</w:t>
+            </w:r>
+            <w:r>
+              <w:t xml:space="preserve"> </w:t>
+            </w:r>
+            <w:r>
+              <w:t xml:space="preserve">o «nombre de archivo demasiado largo» (Windows con OneDrive)</w:t>
+            </w:r>
+          </w:p>
+        </w:tc>
+        <w:tc>
+          <w:tcPr/>
+          <w:p>
+            <w:pPr>
+              <w:pStyle w:val="Compact"/>
+            </w:pPr>
+            <w:r>
+              <w:t xml:space="preserve">Ruta de usuario con caracteres especiales</w:t>
+            </w:r>
+          </w:p>
+        </w:tc>
+        <w:tc>
+          <w:tcPr/>
+          <w:p>
+            <w:pPr>
+              <w:pStyle w:val="Compact"/>
+            </w:pPr>
+            <w:r>
               <w:t xml:space="preserve">Ejecutar</w:t>
             </w:r>
             <w:r>
@@ -3310,21 +3772,12 @@
         </w:tc>
       </w:tr>
     </w:tbl>
-    <w:bookmarkEnd w:id="26"/>
-    <w:bookmarkStart w:id="27" w:name="recursos-y-para-saber-más"/>
+    <w:bookmarkEnd w:id="27"/>
+    <w:bookmarkStart w:id="28" w:name="recursos-y-para-saber-más"/>
     <w:p>
       <w:pPr>
         <w:pStyle w:val="Heading1"/>
       </w:pPr>
-      <w:r>
-        <w:rPr>
-          <w:rStyle w:val="SectionNumber"/>
-        </w:rPr>
-        <w:t xml:space="preserve">7</w:t>
-      </w:r>
-      <w:r>
-        <w:tab/>
-      </w:r>
       <w:r>
         <w:t xml:space="preserve">Recursos y para saber más</w:t>
       </w:r>
@@ -3348,7 +3801,7 @@
         <w:pStyle w:val="Compact"/>
         <w:numPr>
           <w:ilvl w:val="0"/>
-          <w:numId w:val="1009"/>
+          <w:numId w:val="1012"/>
         </w:numPr>
       </w:pPr>
       <w:r>
@@ -3402,7 +3855,7 @@
         <w:pStyle w:val="Compact"/>
         <w:numPr>
           <w:ilvl w:val="0"/>
-          <w:numId w:val="1009"/>
+          <w:numId w:val="1012"/>
         </w:numPr>
       </w:pPr>
       <w:r>
@@ -3421,7 +3874,7 @@
         <w:pStyle w:val="Compact"/>
         <w:numPr>
           <w:ilvl w:val="0"/>
-          <w:numId w:val="1009"/>
+          <w:numId w:val="1012"/>
         </w:numPr>
       </w:pPr>
       <w:r>
@@ -3440,7 +3893,7 @@
         <w:pStyle w:val="Compact"/>
         <w:numPr>
           <w:ilvl w:val="0"/>
-          <w:numId w:val="1009"/>
+          <w:numId w:val="1012"/>
         </w:numPr>
       </w:pPr>
       <w:r>
@@ -3478,7 +3931,7 @@
         <w:pStyle w:val="Compact"/>
         <w:numPr>
           <w:ilvl w:val="0"/>
-          <w:numId w:val="1009"/>
+          <w:numId w:val="1012"/>
         </w:numPr>
       </w:pPr>
       <w:r>
@@ -3508,22 +3961,13 @@
         <w:t xml:space="preserve">: orquestación y fijación de versiones para la reproducibilidad.</w:t>
       </w:r>
     </w:p>
-    <w:bookmarkEnd w:id="27"/>
-    <w:bookmarkStart w:id="28" w:name="idea-principal"/>
+    <w:bookmarkEnd w:id="28"/>
+    <w:bookmarkStart w:id="29" w:name="idea-principal"/>
     <w:p>
       <w:pPr>
         <w:pStyle w:val="Heading1"/>
       </w:pPr>
       <w:r>
-        <w:rPr>
-          <w:rStyle w:val="SectionNumber"/>
-        </w:rPr>
-        <w:t xml:space="preserve">8</w:t>
-      </w:r>
-      <w:r>
-        <w:tab/>
-      </w:r>
-      <w:r>
         <w:t xml:space="preserve">Idea principal</w:t>
       </w:r>
     </w:p>
@@ -3571,14 +4015,11 @@
         <w:t xml:space="preserve">el objeto de esta práctica.</w:t>
       </w:r>
     </w:p>
-    <w:bookmarkEnd w:id="28"/>
+    <w:bookmarkEnd w:id="29"/>
     <w:sectPr>
-      <w:footerReference w:type="default" r:id="rIdGuiaFooter"/>
       <w:footnotePr>
         <w:numRestart w:val="eachSect"/>
       </w:footnotePr>
-      <w:pgSz w:w="11906" w:h="16838"/>
-      <w:pgMar w:top="1418" w:right="1418" w:bottom="1418" w:left="1418" w:header="709" w:footer="709" w:gutter="0"/>
     </w:sectPr>
   </w:body>
 </w:document>
@@ -3586,25 +4027,6 @@
 
 <file path=word/comments.xml><?xml version="1.0" encoding="utf-8"?>
 <w:comments xmlns:w="http://schemas.openxmlformats.org/wordprocessingml/2006/main" xmlns:m="http://schemas.openxmlformats.org/officeDocument/2006/math" xmlns:r="http://schemas.openxmlformats.org/officeDocument/2006/relationships" xmlns:o="urn:schemas-microsoft-com:office:office" xmlns:v="urn:schemas-microsoft-com:vml" xmlns:w10="urn:schemas-microsoft-com:office:word" xmlns:a="http://schemas.openxmlformats.org/drawingml/2006/main" xmlns:pic="http://schemas.openxmlformats.org/drawingml/2006/picture" xmlns:wp="http://schemas.openxmlformats.org/drawingml/2006/wordprocessingDrawing"/>
-</file>
-
-<file path=word/footer1.xml><?xml version="1.0" encoding="utf-8"?>
-<w:ftr xmlns:w="http://schemas.openxmlformats.org/wordprocessingml/2006/main">
-  <w:p>
-    <w:pPr>
-      <w:jc w:val="center"/>
-    </w:pPr>
-    <w:r>
-      <w:fldChar w:fldCharType="begin"/>
-    </w:r>
-    <w:r>
-      <w:instrText xml:space="preserve"> PAGE </w:instrText>
-    </w:r>
-    <w:r>
-      <w:fldChar w:fldCharType="end"/>
-    </w:r>
-  </w:p>
-</w:ftr>
 </file>
 
 <file path=word/footnotes.xml><?xml version="1.0" encoding="utf-8"?>
@@ -3977,6 +4399,91 @@
       </w:pPr>
     </w:lvl>
   </w:abstractNum>
+  <w:abstractNum w:abstractNumId="99412">
+    <w:nsid w:val="00A99412"/>
+    <w:multiLevelType w:val="multilevel"/>
+    <w:lvl w:ilvl="0">
+      <w:start w:val="2"/>
+      <w:numFmt w:val="decimal"/>
+      <w:lvlText w:val="%1."/>
+      <w:lvlJc w:val="left"/>
+      <w:pPr>
+        <w:ind w:left="720" w:hanging="360"/>
+      </w:pPr>
+    </w:lvl>
+    <w:lvl w:ilvl="1">
+      <w:start w:val="2"/>
+      <w:numFmt w:val="decimal"/>
+      <w:lvlText w:val="%2."/>
+      <w:lvlJc w:val="left"/>
+      <w:pPr>
+        <w:ind w:left="1440" w:hanging="360"/>
+      </w:pPr>
+    </w:lvl>
+    <w:lvl w:ilvl="2">
+      <w:start w:val="2"/>
+      <w:numFmt w:val="decimal"/>
+      <w:lvlText w:val="%3."/>
+      <w:lvlJc w:val="left"/>
+      <w:pPr>
+        <w:ind w:left="2160" w:hanging="360"/>
+      </w:pPr>
+    </w:lvl>
+    <w:lvl w:ilvl="3">
+      <w:start w:val="2"/>
+      <w:numFmt w:val="decimal"/>
+      <w:lvlText w:val="%4."/>
+      <w:lvlJc w:val="left"/>
+      <w:pPr>
+        <w:ind w:left="2880" w:hanging="360"/>
+      </w:pPr>
+    </w:lvl>
+    <w:lvl w:ilvl="4">
+      <w:start w:val="2"/>
+      <w:numFmt w:val="decimal"/>
+      <w:lvlText w:val="%5."/>
+      <w:lvlJc w:val="left"/>
+      <w:pPr>
+        <w:ind w:left="3600" w:hanging="360"/>
+      </w:pPr>
+    </w:lvl>
+    <w:lvl w:ilvl="5">
+      <w:start w:val="2"/>
+      <w:numFmt w:val="decimal"/>
+      <w:lvlText w:val="%6."/>
+      <w:lvlJc w:val="left"/>
+      <w:pPr>
+        <w:ind w:left="4320" w:hanging="360"/>
+      </w:pPr>
+    </w:lvl>
+    <w:lvl w:ilvl="6">
+      <w:start w:val="2"/>
+      <w:numFmt w:val="decimal"/>
+      <w:lvlText w:val="%7."/>
+      <w:lvlJc w:val="left"/>
+      <w:pPr>
+        <w:ind w:left="5040" w:hanging="360"/>
+      </w:pPr>
+    </w:lvl>
+    <w:lvl w:ilvl="7">
+      <w:start w:val="2"/>
+      <w:numFmt w:val="decimal"/>
+      <w:lvlText w:val="%8."/>
+      <w:lvlJc w:val="left"/>
+      <w:pPr>
+        <w:ind w:left="5760" w:hanging="360"/>
+      </w:pPr>
+    </w:lvl>
+    <w:lvl w:ilvl="8">
+      <w:start w:val="2"/>
+      <w:numFmt w:val="decimal"/>
+      <w:lvlText w:val="%9."/>
+      <w:lvlJc w:val="left"/>
+      <w:pPr>
+        <w:ind w:left="6480" w:hanging="360"/>
+      </w:pPr>
+    </w:lvl>
+  </w:abstractNum>
   <w:num w:numId="1000">
     <w:abstractNumId w:val="990"/>
   </w:num>
@@ -4194,6 +4701,96 @@
     </w:lvlOverride>
   </w:num>
   <w:num w:numId="1009">
+    <w:abstractNumId w:val="99411"/>
+    <w:lvlOverride w:ilvl="0">
+      <w:startOverride w:val="1"/>
+    </w:lvlOverride>
+    <w:lvlOverride w:ilvl="1">
+      <w:startOverride w:val="1"/>
+    </w:lvlOverride>
+    <w:lvlOverride w:ilvl="2">
+      <w:startOverride w:val="1"/>
+    </w:lvlOverride>
+    <w:lvlOverride w:ilvl="3">
+      <w:startOverride w:val="1"/>
+    </w:lvlOverride>
+    <w:lvlOverride w:ilvl="4">
+      <w:startOverride w:val="1"/>
+    </w:lvlOverride>
+    <w:lvlOverride w:ilvl="5">
+      <w:startOverride w:val="1"/>
+    </w:lvlOverride>
+    <w:lvlOverride w:ilvl="6">
+      <w:startOverride w:val="1"/>
+    </w:lvlOverride>
+    <w:lvlOverride w:ilvl="7">
+      <w:startOverride w:val="1"/>
+    </w:lvlOverride>
+    <w:lvlOverride w:ilvl="8">
+      <w:startOverride w:val="1"/>
+    </w:lvlOverride>
+  </w:num>
+  <w:num w:numId="1010">
+    <w:abstractNumId w:val="99412"/>
+    <w:lvlOverride w:ilvl="0">
+      <w:startOverride w:val="2"/>
+    </w:lvlOverride>
+    <w:lvlOverride w:ilvl="1">
+      <w:startOverride w:val="2"/>
+    </w:lvlOverride>
+    <w:lvlOverride w:ilvl="2">
+      <w:startOverride w:val="2"/>
+    </w:lvlOverride>
+    <w:lvlOverride w:ilvl="3">
+      <w:startOverride w:val="2"/>
+    </w:lvlOverride>
+    <w:lvlOverride w:ilvl="4">
+      <w:startOverride w:val="2"/>
+    </w:lvlOverride>
+    <w:lvlOverride w:ilvl="5">
+      <w:startOverride w:val="2"/>
+    </w:lvlOverride>
+    <w:lvlOverride w:ilvl="6">
+      <w:startOverride w:val="2"/>
+    </w:lvlOverride>
+    <w:lvlOverride w:ilvl="7">
+      <w:startOverride w:val="2"/>
+    </w:lvlOverride>
+    <w:lvlOverride w:ilvl="8">
+      <w:startOverride w:val="2"/>
+    </w:lvlOverride>
+  </w:num>
+  <w:num w:numId="1011">
+    <w:abstractNumId w:val="99413"/>
+    <w:lvlOverride w:ilvl="0">
+      <w:startOverride w:val="3"/>
+    </w:lvlOverride>
+    <w:lvlOverride w:ilvl="1">
+      <w:startOverride w:val="3"/>
+    </w:lvlOverride>
+    <w:lvlOverride w:ilvl="2">
+      <w:startOverride w:val="3"/>
+    </w:lvlOverride>
+    <w:lvlOverride w:ilvl="3">
+      <w:startOverride w:val="3"/>
+    </w:lvlOverride>
+    <w:lvlOverride w:ilvl="4">
+      <w:startOverride w:val="3"/>
+    </w:lvlOverride>
+    <w:lvlOverride w:ilvl="5">
+      <w:startOverride w:val="3"/>
+    </w:lvlOverride>
+    <w:lvlOverride w:ilvl="6">
+      <w:startOverride w:val="3"/>
+    </w:lvlOverride>
+    <w:lvlOverride w:ilvl="7">
+      <w:startOverride w:val="3"/>
+    </w:lvlOverride>
+    <w:lvlOverride w:ilvl="8">
+      <w:startOverride w:val="3"/>
+    </w:lvlOverride>
+  </w:num>
+  <w:num w:numId="1012">
     <w:abstractNumId w:val="991"/>
   </w:num>
 </w:numbering>
@@ -5135,7 +5732,7 @@
     </a:clrScheme>
     <a:fontScheme name="Office">
       <a:majorFont>
-        <a:latin typeface="Cambria" panose="02110004020202020204"/>
+        <a:latin typeface="Aptos Display" panose="02110004020202020204"/>
         <a:ea typeface=""/>
         <a:cs typeface=""/>
         <a:font script="Jpan" typeface="游ゴシック Light"/>
@@ -5187,7 +5784,7 @@
         <a:font script="Tfng" typeface="Ebrima"/>
       </a:majorFont>
       <a:minorFont>
-        <a:latin typeface="Cambria" panose="02110004020202020204"/>
+        <a:latin typeface="Aptos" panose="02110004020202020204"/>
         <a:ea typeface=""/>
         <a:cs typeface=""/>
         <a:font script="Jpan" typeface="游明朝"/>

</xml_diff>

<commit_message>
Reorder exercises 3 and 4 in student guide to match slide narrative
Join-inflation exercise is now exercise 3 (before cache demo); QC threshold
exercise is now exercise 4. Error table updated accordingly.
</commit_message>
<xml_diff>
--- a/GUIA_ALUMNO.docx
+++ b/GUIA_ALUMNO.docx
@@ -2101,13 +2101,13 @@
       </w:r>
     </w:p>
     <w:bookmarkEnd w:id="23"/>
-    <w:bookmarkStart w:id="24" w:name="Xfb5c44627e274effbcca9358a07b0bc721b69df"/>
+    <w:bookmarkStart w:id="24" w:name="ejercicio-3-el-join-que-infla-filas"/>
     <w:p>
       <w:pPr>
         <w:pStyle w:val="Heading2"/>
       </w:pPr>
       <w:r>
-        <w:t xml:space="preserve">Ejercicio 3 — Cambiar el umbral de control de calidad</w:t>
+        <w:t xml:space="preserve">Ejercicio 3 — El join que infla filas</w:t>
       </w:r>
     </w:p>
     <w:p>
@@ -2115,22 +2115,7 @@
         <w:pStyle w:val="FirstParagraph"/>
       </w:pPr>
       <w:r>
-        <w:t xml:space="preserve">Este ejercicio muestra la capacidad más útil de</w:t>
-      </w:r>
-      <w:r>
-        <w:t xml:space="preserve"> </w:t>
-      </w:r>
-      <w:r>
-        <w:rPr>
-          <w:rStyle w:val="VerbatimChar"/>
-        </w:rPr>
-        <w:t xml:space="preserve">targets</w:t>
-      </w:r>
-      <w:r>
-        <w:t xml:space="preserve"> </w:t>
-      </w:r>
-      <w:r>
-        <w:t xml:space="preserve">en el día a día: si modificas algo,</w:t>
+        <w:t xml:space="preserve">Este es uno de los errores más frecuentes y difíciles de detectar cuando integras resultados con el diseño de muestreo: la tabla de emplazamientos tiene</w:t>
       </w:r>
       <w:r>
         <w:t xml:space="preserve"> </w:t>
@@ -2140,430 +2125,519 @@
           <w:b/>
           <w:bCs/>
         </w:rPr>
-        <w:t xml:space="preserve">solo recalcula lo que depende de ese algo</w:t>
-      </w:r>
-      <w:r>
-        <w:t xml:space="preserve">. El resto se reutiliza de la caché sin ejecutarse de nuevo.</w:t>
-      </w:r>
-    </w:p>
-    <w:p>
-      <w:pPr>
-        <w:pStyle w:val="BodyText"/>
-      </w:pPr>
+        <w:t xml:space="preserve">dos filas para el mismo grabador</w:t>
+      </w:r>
+      <w:r>
+        <w:t xml:space="preserve"> </w:t>
+      </w:r>
+      <w:r>
+        <w:t xml:space="preserve">(por una doble clasificación de hábitat, una fila duplicada accidental, o datos de dos técnicos sin reconciliar), y cada grabación de ese grabador se multiplica en la tabla final</w:t>
+      </w:r>
+      <w:r>
+        <w:t xml:space="preserve"> </w:t>
+      </w:r>
       <w:r>
         <w:rPr>
           <w:b/>
           <w:bCs/>
         </w:rPr>
+        <w:t xml:space="preserve">sin ningún mensaje de error de R</w:t>
+      </w:r>
+      <w:r>
+        <w:t xml:space="preserve">.</w:t>
+      </w:r>
+    </w:p>
+    <w:p>
+      <w:pPr>
+        <w:pStyle w:val="BodyText"/>
+      </w:pPr>
+      <w:r>
+        <w:t xml:space="preserve">El flujo incluye un guardarraíl que lo detecta. Aquí lo vas a provocar para ver cómo funciona.</w:t>
+      </w:r>
+    </w:p>
+    <w:p>
+      <w:pPr>
+        <w:pStyle w:val="BodyText"/>
+      </w:pPr>
+      <w:r>
+        <w:rPr>
+          <w:b/>
+          <w:bCs/>
+        </w:rPr>
         <w:t xml:space="preserve">Paso 1.</w:t>
       </w:r>
       <w:r>
         <w:t xml:space="preserve"> </w:t>
       </w:r>
       <w:r>
-        <w:t xml:space="preserve">Abre</w:t>
-      </w:r>
-      <w:r>
-        <w:t xml:space="preserve"> </w:t>
-      </w:r>
-      <w:r>
-        <w:rPr>
-          <w:rStyle w:val="VerbatimChar"/>
-        </w:rPr>
-        <w:t xml:space="preserve">R/qc.R</w:t>
-      </w:r>
-      <w:r>
-        <w:t xml:space="preserve"> </w:t>
-      </w:r>
-      <w:r>
-        <w:t xml:space="preserve">desde el panel</w:t>
-      </w:r>
-      <w:r>
-        <w:t xml:space="preserve"> </w:t>
-      </w:r>
+        <w:t xml:space="preserve">Abre (o vuelve a)</w:t>
+      </w:r>
+      <w:r>
+        <w:t xml:space="preserve"> </w:t>
+      </w:r>
+      <w:r>
+        <w:rPr>
+          <w:rStyle w:val="VerbatimChar"/>
+        </w:rPr>
+        <w:t xml:space="preserve">_targets.R</w:t>
+      </w:r>
+      <w:r>
+        <w:t xml:space="preserve"> </w:t>
+      </w:r>
+      <w:r>
+        <w:t xml:space="preserve">y localiza la línea:</w:t>
+      </w:r>
+    </w:p>
+    <w:p>
+      <w:pPr>
+        <w:pStyle w:val="SourceCode"/>
+      </w:pPr>
+      <w:r>
+        <w:rPr>
+          <w:rStyle w:val="FunctionTok"/>
+        </w:rPr>
+        <w:t xml:space="preserve">tar_target</w:t>
+      </w:r>
+      <w:r>
+        <w:rPr>
+          <w:rStyle w:val="NormalTok"/>
+        </w:rPr>
+        <w:t xml:space="preserve">(sites_file, </w:t>
+      </w:r>
+      <w:r>
+        <w:rPr>
+          <w:rStyle w:val="StringTok"/>
+        </w:rPr>
+        <w:t xml:space="preserve">"data/sites.csv"</w:t>
+      </w:r>
+      <w:r>
+        <w:rPr>
+          <w:rStyle w:val="NormalTok"/>
+        </w:rPr>
+        <w:t xml:space="preserve">, </w:t>
+      </w:r>
+      <w:r>
+        <w:rPr>
+          <w:rStyle w:val="AttributeTok"/>
+        </w:rPr>
+        <w:t xml:space="preserve">format =</w:t>
+      </w:r>
+      <w:r>
+        <w:rPr>
+          <w:rStyle w:val="NormalTok"/>
+        </w:rPr>
+        <w:t xml:space="preserve"> </w:t>
+      </w:r>
+      <w:r>
+        <w:rPr>
+          <w:rStyle w:val="StringTok"/>
+        </w:rPr>
+        <w:t xml:space="preserve">"file"</w:t>
+      </w:r>
+      <w:r>
+        <w:rPr>
+          <w:rStyle w:val="NormalTok"/>
+        </w:rPr>
+        <w:t xml:space="preserve">),</w:t>
+      </w:r>
+    </w:p>
+    <w:p>
+      <w:pPr>
+        <w:pStyle w:val="FirstParagraph"/>
+      </w:pPr>
+      <w:r>
+        <w:t xml:space="preserve">Cámbiala a:</w:t>
+      </w:r>
+    </w:p>
+    <w:p>
+      <w:pPr>
+        <w:pStyle w:val="SourceCode"/>
+      </w:pPr>
+      <w:r>
+        <w:rPr>
+          <w:rStyle w:val="FunctionTok"/>
+        </w:rPr>
+        <w:t xml:space="preserve">tar_target</w:t>
+      </w:r>
+      <w:r>
+        <w:rPr>
+          <w:rStyle w:val="NormalTok"/>
+        </w:rPr>
+        <w:t xml:space="preserve">(sites_file, </w:t>
+      </w:r>
+      <w:r>
+        <w:rPr>
+          <w:rStyle w:val="StringTok"/>
+        </w:rPr>
+        <w:t xml:space="preserve">"data/sites_duplicate.csv"</w:t>
+      </w:r>
+      <w:r>
+        <w:rPr>
+          <w:rStyle w:val="NormalTok"/>
+        </w:rPr>
+        <w:t xml:space="preserve">, </w:t>
+      </w:r>
+      <w:r>
+        <w:rPr>
+          <w:rStyle w:val="AttributeTok"/>
+        </w:rPr>
+        <w:t xml:space="preserve">format =</w:t>
+      </w:r>
+      <w:r>
+        <w:rPr>
+          <w:rStyle w:val="NormalTok"/>
+        </w:rPr>
+        <w:t xml:space="preserve"> </w:t>
+      </w:r>
+      <w:r>
+        <w:rPr>
+          <w:rStyle w:val="StringTok"/>
+        </w:rPr>
+        <w:t xml:space="preserve">"file"</w:t>
+      </w:r>
+      <w:r>
+        <w:rPr>
+          <w:rStyle w:val="NormalTok"/>
+        </w:rPr>
+        <w:t xml:space="preserve">),</w:t>
+      </w:r>
+    </w:p>
+    <w:p>
+      <w:pPr>
+        <w:pStyle w:val="FirstParagraph"/>
+      </w:pPr>
+      <w:r>
+        <w:rPr>
+          <w:b/>
+          <w:bCs/>
+        </w:rPr>
+        <w:t xml:space="preserve">Paso 2.</w:t>
+      </w:r>
+      <w:r>
+        <w:t xml:space="preserve"> </w:t>
+      </w:r>
+      <w:r>
+        <w:t xml:space="preserve">Guarda y ejecuta el bloque del Ejercicio 3 en</w:t>
+      </w:r>
+      <w:r>
+        <w:t xml:space="preserve"> </w:t>
+      </w:r>
+      <w:r>
+        <w:rPr>
+          <w:rStyle w:val="VerbatimChar"/>
+        </w:rPr>
+        <w:t xml:space="preserve">practica.R</w:t>
+      </w:r>
+      <w:r>
+        <w:t xml:space="preserve">:</w:t>
+      </w:r>
+    </w:p>
+    <w:p>
+      <w:pPr>
+        <w:pStyle w:val="SourceCode"/>
+      </w:pPr>
+      <w:r>
+        <w:rPr>
+          <w:rStyle w:val="NormalTok"/>
+        </w:rPr>
+        <w:t xml:space="preserve">targets</w:t>
+      </w:r>
+      <w:r>
+        <w:rPr>
+          <w:rStyle w:val="SpecialCharTok"/>
+        </w:rPr>
+        <w:t xml:space="preserve">::</w:t>
+      </w:r>
+      <w:r>
+        <w:rPr>
+          <w:rStyle w:val="FunctionTok"/>
+        </w:rPr>
+        <w:t xml:space="preserve">tar_make</w:t>
+      </w:r>
+      <w:r>
+        <w:rPr>
+          <w:rStyle w:val="NormalTok"/>
+        </w:rPr>
+        <w:t xml:space="preserve">()</w:t>
+      </w:r>
+    </w:p>
+    <w:p>
+      <w:pPr>
+        <w:pStyle w:val="FirstParagraph"/>
+      </w:pPr>
+      <w:r>
+        <w:rPr>
+          <w:b/>
+          <w:bCs/>
+        </w:rPr>
+        <w:t xml:space="preserve">Lo que verás.</w:t>
+      </w:r>
+      <w:r>
+        <w:t xml:space="preserve"> </w:t>
+      </w:r>
+      <w:r>
+        <w:t xml:space="preserve">Dos avisos en la consola:</w:t>
+      </w:r>
+    </w:p>
+    <w:p>
+      <w:pPr>
+        <w:pStyle w:val="SourceCode"/>
+      </w:pPr>
+      <w:r>
+        <w:rPr>
+          <w:rStyle w:val="VerbatimChar"/>
+        </w:rPr>
+        <w:t xml:space="preserve">Detected an unexpected many-to-many relationship between `x` and `y`.</w:t>
+      </w:r>
+      <w:r>
+        <w:br/>
+      </w:r>
+      <w:r>
+        <w:rPr>
+          <w:rStyle w:val="VerbatimChar"/>
+        </w:rPr>
+        <w:t xml:space="preserve">El join cambió el nº de filas (5 -&gt; 7). Revisa claves duplicadas en 'sites' o 'meta'.</w:t>
+      </w:r>
+    </w:p>
+    <w:p>
+      <w:pPr>
+        <w:pStyle w:val="FirstParagraph"/>
+      </w:pPr>
+      <w:r>
+        <w:t xml:space="preserve">La tabla tiene</w:t>
+      </w:r>
+      <w:r>
+        <w:t xml:space="preserve"> </w:t>
+      </w:r>
+      <w:r>
+        <w:rPr>
+          <w:b/>
+          <w:bCs/>
+        </w:rPr>
+        <w:t xml:space="preserve">7 filas en lugar de 5</w:t>
+      </w:r>
+      <w:r>
+        <w:t xml:space="preserve">. Las grabaciones del grabador AM02 aparecen duplicadas: una fila con hábitat</w:t>
+      </w:r>
+      <w:r>
+        <w:t xml:space="preserve"> </w:t>
+      </w:r>
+      <w:r>
+        <w:rPr>
+          <w:rStyle w:val="VerbatimChar"/>
+        </w:rPr>
+        <w:t xml:space="preserve">matorral</w:t>
+      </w:r>
+      <w:r>
+        <w:t xml:space="preserve"> </w:t>
+      </w:r>
+      <w:r>
+        <w:t xml:space="preserve">y otra con</w:t>
+      </w:r>
+      <w:r>
+        <w:t xml:space="preserve"> </w:t>
+      </w:r>
+      <w:r>
+        <w:rPr>
+          <w:rStyle w:val="VerbatimChar"/>
+        </w:rPr>
+        <w:t xml:space="preserve">pastizal</w:t>
+      </w:r>
+      <w:r>
+        <w:t xml:space="preserve">. Los índices acústicos y las fechas son correctos en las dos filas; el error solo se ve en el número de filas.</w:t>
+      </w:r>
+    </w:p>
+    <w:p>
+      <w:pPr>
+        <w:pStyle w:val="BodyText"/>
+      </w:pPr>
+      <w:r>
+        <w:t xml:space="preserve">Para encontrar qué fila está duplicada:</w:t>
+      </w:r>
+    </w:p>
+    <w:p>
+      <w:pPr>
+        <w:pStyle w:val="SourceCode"/>
+      </w:pPr>
+      <w:r>
+        <w:rPr>
+          <w:rStyle w:val="NormalTok"/>
+        </w:rPr>
+        <w:t xml:space="preserve">sites_dup </w:t>
+      </w:r>
+      <w:r>
+        <w:rPr>
+          <w:rStyle w:val="OtherTok"/>
+        </w:rPr>
+        <w:t xml:space="preserve">&lt;-</w:t>
+      </w:r>
+      <w:r>
+        <w:rPr>
+          <w:rStyle w:val="NormalTok"/>
+        </w:rPr>
+        <w:t xml:space="preserve"> </w:t>
+      </w:r>
+      <w:r>
+        <w:rPr>
+          <w:rStyle w:val="FunctionTok"/>
+        </w:rPr>
+        <w:t xml:space="preserve">read.csv</w:t>
+      </w:r>
+      <w:r>
+        <w:rPr>
+          <w:rStyle w:val="NormalTok"/>
+        </w:rPr>
+        <w:t xml:space="preserve">(</w:t>
+      </w:r>
+      <w:r>
+        <w:rPr>
+          <w:rStyle w:val="StringTok"/>
+        </w:rPr>
+        <w:t xml:space="preserve">"data/sites_duplicate.csv"</w:t>
+      </w:r>
+      <w:r>
+        <w:rPr>
+          <w:rStyle w:val="NormalTok"/>
+        </w:rPr>
+        <w:t xml:space="preserve">)</w:t>
+      </w:r>
+      <w:r>
+        <w:br/>
+      </w:r>
+      <w:r>
+        <w:rPr>
+          <w:rStyle w:val="NormalTok"/>
+        </w:rPr>
+        <w:t xml:space="preserve">sites_dup[</w:t>
+      </w:r>
+      <w:r>
+        <w:rPr>
+          <w:rStyle w:val="FunctionTok"/>
+        </w:rPr>
+        <w:t xml:space="preserve">duplicated</w:t>
+      </w:r>
+      <w:r>
+        <w:rPr>
+          <w:rStyle w:val="NormalTok"/>
+        </w:rPr>
+        <w:t xml:space="preserve">(sites_dup</w:t>
+      </w:r>
+      <w:r>
+        <w:rPr>
+          <w:rStyle w:val="SpecialCharTok"/>
+        </w:rPr>
+        <w:t xml:space="preserve">$</w:t>
+      </w:r>
+      <w:r>
+        <w:rPr>
+          <w:rStyle w:val="NormalTok"/>
+        </w:rPr>
+        <w:t xml:space="preserve">recorder_id), ]</w:t>
+      </w:r>
+    </w:p>
+    <w:p>
+      <w:pPr>
+        <w:pStyle w:val="FirstParagraph"/>
+      </w:pPr>
+      <w:r>
+        <w:t xml:space="preserve">Si el aviso no aparece,</w:t>
+      </w:r>
+      <w:r>
+        <w:t xml:space="preserve"> </w:t>
+      </w:r>
+      <w:r>
+        <w:rPr>
+          <w:rStyle w:val="VerbatimChar"/>
+        </w:rPr>
+        <w:t xml:space="preserve">targets</w:t>
+      </w:r>
+      <w:r>
+        <w:t xml:space="preserve"> </w:t>
+      </w:r>
+      <w:r>
+        <w:t xml:space="preserve">puede haber reutilizado</w:t>
+      </w:r>
+      <w:r>
+        <w:t xml:space="preserve"> </w:t>
+      </w:r>
+      <w:r>
+        <w:rPr>
+          <w:rStyle w:val="VerbatimChar"/>
+        </w:rPr>
+        <w:t xml:space="preserve">final_table</w:t>
+      </w:r>
+      <w:r>
+        <w:t xml:space="preserve"> </w:t>
+      </w:r>
+      <w:r>
+        <w:t xml:space="preserve">de la caché. Ejecuta esto y repite:</w:t>
+      </w:r>
+    </w:p>
+    <w:p>
+      <w:pPr>
+        <w:pStyle w:val="SourceCode"/>
+      </w:pPr>
+      <w:r>
+        <w:rPr>
+          <w:rStyle w:val="NormalTok"/>
+        </w:rPr>
+        <w:t xml:space="preserve">targets</w:t>
+      </w:r>
+      <w:r>
+        <w:rPr>
+          <w:rStyle w:val="SpecialCharTok"/>
+        </w:rPr>
+        <w:t xml:space="preserve">::</w:t>
+      </w:r>
+      <w:r>
+        <w:rPr>
+          <w:rStyle w:val="FunctionTok"/>
+        </w:rPr>
+        <w:t xml:space="preserve">tar_invalidate</w:t>
+      </w:r>
+      <w:r>
+        <w:rPr>
+          <w:rStyle w:val="NormalTok"/>
+        </w:rPr>
+        <w:t xml:space="preserve">(final_table)</w:t>
+      </w:r>
+      <w:r>
+        <w:br/>
+      </w:r>
+      <w:r>
+        <w:rPr>
+          <w:rStyle w:val="NormalTok"/>
+        </w:rPr>
+        <w:t xml:space="preserve">targets</w:t>
+      </w:r>
+      <w:r>
+        <w:rPr>
+          <w:rStyle w:val="SpecialCharTok"/>
+        </w:rPr>
+        <w:t xml:space="preserve">::</w:t>
+      </w:r>
+      <w:r>
+        <w:rPr>
+          <w:rStyle w:val="FunctionTok"/>
+        </w:rPr>
+        <w:t xml:space="preserve">tar_make</w:t>
+      </w:r>
+      <w:r>
+        <w:rPr>
+          <w:rStyle w:val="NormalTok"/>
+        </w:rPr>
+        <w:t xml:space="preserve">()</w:t>
+      </w:r>
+    </w:p>
+    <w:p>
+      <w:pPr>
+        <w:pStyle w:val="FirstParagraph"/>
+      </w:pPr>
       <w:r>
         <w:rPr>
           <w:i/>
           <w:iCs/>
         </w:rPr>
-        <w:t xml:space="preserve">Files</w:t>
-      </w:r>
-      <w:r>
-        <w:t xml:space="preserve"> </w:t>
-      </w:r>
-      <w:r>
-        <w:t xml:space="preserve">(carpeta</w:t>
-      </w:r>
-      <w:r>
-        <w:t xml:space="preserve"> </w:t>
-      </w:r>
-      <w:r>
-        <w:rPr>
-          <w:rStyle w:val="VerbatimChar"/>
-        </w:rPr>
-        <w:t xml:space="preserve">R/</w:t>
-      </w:r>
-      <w:r>
-        <w:t xml:space="preserve"> </w:t>
-      </w:r>
-      <w:r>
-        <w:t xml:space="preserve">→ archivo</w:t>
-      </w:r>
-      <w:r>
-        <w:t xml:space="preserve"> </w:t>
-      </w:r>
-      <w:r>
-        <w:rPr>
-          <w:rStyle w:val="VerbatimChar"/>
-        </w:rPr>
-        <w:t xml:space="preserve">qc.R</w:t>
-      </w:r>
-      <w:r>
-        <w:t xml:space="preserve">). Localiza la función</w:t>
-      </w:r>
-      <w:r>
-        <w:t xml:space="preserve"> </w:t>
-      </w:r>
-      <w:r>
-        <w:rPr>
-          <w:rStyle w:val="VerbatimChar"/>
-        </w:rPr>
-        <w:t xml:space="preserve">qc_flag()</w:t>
-      </w:r>
-      <w:r>
-        <w:t xml:space="preserve">. La primera línea es:</w:t>
-      </w:r>
-    </w:p>
-    <w:p>
-      <w:pPr>
-        <w:pStyle w:val="SourceCode"/>
-      </w:pPr>
-      <w:r>
-        <w:rPr>
-          <w:rStyle w:val="NormalTok"/>
-        </w:rPr>
-        <w:t xml:space="preserve">qc_flag </w:t>
-      </w:r>
-      <w:r>
-        <w:rPr>
-          <w:rStyle w:val="OtherTok"/>
-        </w:rPr>
-        <w:t xml:space="preserve">&lt;-</w:t>
-      </w:r>
-      <w:r>
-        <w:rPr>
-          <w:rStyle w:val="NormalTok"/>
-        </w:rPr>
-        <w:t xml:space="preserve"> </w:t>
-      </w:r>
-      <w:r>
-        <w:rPr>
-          <w:rStyle w:val="ControlFlowTok"/>
-        </w:rPr>
-        <w:t xml:space="preserve">function</w:t>
-      </w:r>
-      <w:r>
-        <w:rPr>
-          <w:rStyle w:val="NormalTok"/>
-        </w:rPr>
-        <w:t xml:space="preserve">(meta, </w:t>
-      </w:r>
-      <w:r>
-        <w:rPr>
-          <w:rStyle w:val="AttributeTok"/>
-        </w:rPr>
-        <w:t xml:space="preserve">expected_dur_s =</w:t>
-      </w:r>
-      <w:r>
-        <w:rPr>
-          <w:rStyle w:val="NormalTok"/>
-        </w:rPr>
-        <w:t xml:space="preserve"> </w:t>
-      </w:r>
-      <w:r>
-        <w:rPr>
-          <w:rStyle w:val="ConstantTok"/>
-        </w:rPr>
-        <w:t xml:space="preserve">NULL</w:t>
-      </w:r>
-      <w:r>
-        <w:rPr>
-          <w:rStyle w:val="NormalTok"/>
-        </w:rPr>
-        <w:t xml:space="preserve">, </w:t>
-      </w:r>
-      <w:r>
-        <w:rPr>
-          <w:rStyle w:val="AttributeTok"/>
-        </w:rPr>
-        <w:t xml:space="preserve">tol_frac =</w:t>
-      </w:r>
-      <w:r>
-        <w:rPr>
-          <w:rStyle w:val="NormalTok"/>
-        </w:rPr>
-        <w:t xml:space="preserve"> </w:t>
-      </w:r>
-      <w:r>
-        <w:rPr>
-          <w:rStyle w:val="FloatTok"/>
-        </w:rPr>
-        <w:t xml:space="preserve">0.05</w:t>
-      </w:r>
-      <w:r>
-        <w:rPr>
-          <w:rStyle w:val="NormalTok"/>
-        </w:rPr>
-        <w:t xml:space="preserve">) {</w:t>
-      </w:r>
-    </w:p>
-    <w:p>
-      <w:pPr>
-        <w:pStyle w:val="FirstParagraph"/>
-      </w:pPr>
-      <w:r>
-        <w:t xml:space="preserve">El parámetro</w:t>
-      </w:r>
-      <w:r>
-        <w:t xml:space="preserve"> </w:t>
-      </w:r>
-      <w:r>
-        <w:rPr>
-          <w:rStyle w:val="VerbatimChar"/>
-        </w:rPr>
-        <w:t xml:space="preserve">tol_frac = 0.05</w:t>
-      </w:r>
-      <w:r>
-        <w:t xml:space="preserve"> </w:t>
-      </w:r>
-      <w:r>
-        <w:t xml:space="preserve">significa que se descartan las grabaciones con una duración que se desvíe más del 5 % de lo esperado. Cámbialo a 0.75:</w:t>
-      </w:r>
-    </w:p>
-    <w:p>
-      <w:pPr>
-        <w:pStyle w:val="SourceCode"/>
-      </w:pPr>
-      <w:r>
-        <w:rPr>
-          <w:rStyle w:val="NormalTok"/>
-        </w:rPr>
-        <w:t xml:space="preserve">qc_flag </w:t>
-      </w:r>
-      <w:r>
-        <w:rPr>
-          <w:rStyle w:val="OtherTok"/>
-        </w:rPr>
-        <w:t xml:space="preserve">&lt;-</w:t>
-      </w:r>
-      <w:r>
-        <w:rPr>
-          <w:rStyle w:val="NormalTok"/>
-        </w:rPr>
-        <w:t xml:space="preserve"> </w:t>
-      </w:r>
-      <w:r>
-        <w:rPr>
-          <w:rStyle w:val="ControlFlowTok"/>
-        </w:rPr>
-        <w:t xml:space="preserve">function</w:t>
-      </w:r>
-      <w:r>
-        <w:rPr>
-          <w:rStyle w:val="NormalTok"/>
-        </w:rPr>
-        <w:t xml:space="preserve">(meta, </w:t>
-      </w:r>
-      <w:r>
-        <w:rPr>
-          <w:rStyle w:val="AttributeTok"/>
-        </w:rPr>
-        <w:t xml:space="preserve">expected_dur_s =</w:t>
-      </w:r>
-      <w:r>
-        <w:rPr>
-          <w:rStyle w:val="NormalTok"/>
-        </w:rPr>
-        <w:t xml:space="preserve"> </w:t>
-      </w:r>
-      <w:r>
-        <w:rPr>
-          <w:rStyle w:val="ConstantTok"/>
-        </w:rPr>
-        <w:t xml:space="preserve">NULL</w:t>
-      </w:r>
-      <w:r>
-        <w:rPr>
-          <w:rStyle w:val="NormalTok"/>
-        </w:rPr>
-        <w:t xml:space="preserve">, </w:t>
-      </w:r>
-      <w:r>
-        <w:rPr>
-          <w:rStyle w:val="AttributeTok"/>
-        </w:rPr>
-        <w:t xml:space="preserve">tol_frac =</w:t>
-      </w:r>
-      <w:r>
-        <w:rPr>
-          <w:rStyle w:val="NormalTok"/>
-        </w:rPr>
-        <w:t xml:space="preserve"> </w:t>
-      </w:r>
-      <w:r>
-        <w:rPr>
-          <w:rStyle w:val="FloatTok"/>
-        </w:rPr>
-        <w:t xml:space="preserve">0.75</w:t>
-      </w:r>
-      <w:r>
-        <w:rPr>
-          <w:rStyle w:val="NormalTok"/>
-        </w:rPr>
-        <w:t xml:space="preserve">) {</w:t>
-      </w:r>
-    </w:p>
-    <w:p>
-      <w:pPr>
-        <w:pStyle w:val="FirstParagraph"/>
-      </w:pPr>
-      <w:r>
-        <w:rPr>
-          <w:b/>
-          <w:bCs/>
-        </w:rPr>
-        <w:t xml:space="preserve">Paso 2.</w:t>
-      </w:r>
-      <w:r>
-        <w:t xml:space="preserve"> </w:t>
-      </w:r>
-      <w:r>
-        <w:t xml:space="preserve">Guarda el archivo (Ctrl+S) y ejecuta el bloque del Ejercicio 3 en</w:t>
-      </w:r>
-      <w:r>
-        <w:t xml:space="preserve"> </w:t>
-      </w:r>
-      <w:r>
-        <w:rPr>
-          <w:rStyle w:val="VerbatimChar"/>
-        </w:rPr>
-        <w:t xml:space="preserve">practica.R</w:t>
-      </w:r>
-      <w:r>
-        <w:t xml:space="preserve">:</w:t>
-      </w:r>
-    </w:p>
-    <w:p>
-      <w:pPr>
-        <w:pStyle w:val="SourceCode"/>
-      </w:pPr>
-      <w:r>
-        <w:rPr>
-          <w:rStyle w:val="NormalTok"/>
-        </w:rPr>
-        <w:t xml:space="preserve">targets</w:t>
-      </w:r>
-      <w:r>
-        <w:rPr>
-          <w:rStyle w:val="SpecialCharTok"/>
-        </w:rPr>
-        <w:t xml:space="preserve">::</w:t>
-      </w:r>
-      <w:r>
-        <w:rPr>
-          <w:rStyle w:val="FunctionTok"/>
-        </w:rPr>
-        <w:t xml:space="preserve">tar_make</w:t>
-      </w:r>
-      <w:r>
-        <w:rPr>
-          <w:rStyle w:val="NormalTok"/>
-        </w:rPr>
-        <w:t xml:space="preserve">()</w:t>
-      </w:r>
-    </w:p>
-    <w:p>
-      <w:pPr>
-        <w:pStyle w:val="FirstParagraph"/>
-      </w:pPr>
-      <w:r>
-        <w:rPr>
-          <w:b/>
-          <w:bCs/>
-        </w:rPr>
-        <w:t xml:space="preserve">Lo que verás.</w:t>
-      </w:r>
-      <w:r>
-        <w:t xml:space="preserve"> </w:t>
-      </w:r>
-      <w:r>
-        <w:t xml:space="preserve">En la consola, algunos targets aparecen como</w:t>
-      </w:r>
-      <w:r>
-        <w:t xml:space="preserve"> </w:t>
-      </w:r>
-      <w:r>
-        <w:rPr>
-          <w:rStyle w:val="VerbatimChar"/>
-        </w:rPr>
-        <w:t xml:space="preserve">skip</w:t>
-      </w:r>
-      <w:r>
-        <w:t xml:space="preserve"> </w:t>
-      </w:r>
-      <w:r>
-        <w:t xml:space="preserve">(se reutilizan de la caché) y otros se recalculan. El parseo de los metadatos —la etapa más costosa— no se vuelve a ejecutar. El resultado cambia:</w:t>
-      </w:r>
-    </w:p>
-    <w:p>
-      <w:pPr>
-        <w:pStyle w:val="SourceCode"/>
-      </w:pPr>
-      <w:r>
-        <w:rPr>
-          <w:rStyle w:val="VerbatimChar"/>
-        </w:rPr>
-        <w:t xml:space="preserve">PASAN QC:  6 / 6</w:t>
-      </w:r>
-    </w:p>
-    <w:p>
-      <w:pPr>
-        <w:pStyle w:val="FirstParagraph"/>
-      </w:pPr>
-      <w:r>
-        <w:t xml:space="preserve">La tabla tiene ahora</w:t>
-      </w:r>
-      <w:r>
-        <w:t xml:space="preserve"> </w:t>
-      </w:r>
-      <w:r>
-        <w:rPr>
-          <w:b/>
-          <w:bCs/>
-        </w:rPr>
-        <w:t xml:space="preserve">6 filas</w:t>
-      </w:r>
-      <w:r>
-        <w:t xml:space="preserve">: la grabación truncada ya no se descarta porque el umbral es ahora mucho más permisivo.</w:t>
-      </w:r>
-    </w:p>
-    <w:p>
-      <w:pPr>
-        <w:pStyle w:val="BodyText"/>
-      </w:pPr>
-      <w:r>
-        <w:t xml:space="preserve">Un umbral de 0.75 significa que se aceptan grabaciones con hasta el 75 % de duración anómala. ¿Tiene sentido para tu proyecto? Eso es una decisión ecológica, no técnica.</w:t>
-      </w:r>
-    </w:p>
-    <w:p>
-      <w:pPr>
-        <w:pStyle w:val="BodyText"/>
-      </w:pPr>
-      <w:r>
-        <w:rPr>
-          <w:i/>
-          <w:iCs/>
-        </w:rPr>
         <w:t xml:space="preserve">Restauración:</w:t>
       </w:r>
       <w:r>
@@ -2579,7 +2653,7 @@
         <w:rPr>
           <w:rStyle w:val="VerbatimChar"/>
         </w:rPr>
-        <w:t xml:space="preserve">tol_frac = 0.05</w:t>
+        <w:t xml:space="preserve">"data/sites.csv"</w:t>
       </w:r>
       <w:r>
         <w:t xml:space="preserve">, guarda y ejecuta</w:t>
@@ -2594,19 +2668,7 @@
         <w:t xml:space="preserve">tar_make()</w:t>
       </w:r>
       <w:r>
-        <w:t xml:space="preserve">. Vuelves a</w:t>
-      </w:r>
-      <w:r>
-        <w:t xml:space="preserve"> </w:t>
-      </w:r>
-      <w:r>
-        <w:rPr>
-          <w:rStyle w:val="VerbatimChar"/>
-        </w:rPr>
-        <w:t xml:space="preserve">PASAN QC: 5 / 6</w:t>
-      </w:r>
-      <w:r>
-        <w:t xml:space="preserve">.</w:t>
+        <w:t xml:space="preserve">. La tabla vuelve a 5 filas.</w:t>
       </w:r>
     </w:p>
     <w:p>
@@ -2617,13 +2679,13 @@
       </w:r>
     </w:p>
     <w:bookmarkEnd w:id="24"/>
-    <w:bookmarkStart w:id="25" w:name="ejercicio-4-el-join-que-infla-filas"/>
+    <w:bookmarkStart w:id="25" w:name="Xfef28437461147de30117609a405240413612e1"/>
     <w:p>
       <w:pPr>
         <w:pStyle w:val="Heading2"/>
       </w:pPr>
       <w:r>
-        <w:t xml:space="preserve">Ejercicio 4 — El join que infla filas</w:t>
+        <w:t xml:space="preserve">Ejercicio 4 — Cambiar el umbral de control de calidad</w:t>
       </w:r>
     </w:p>
     <w:p>
@@ -2631,7 +2693,22 @@
         <w:pStyle w:val="FirstParagraph"/>
       </w:pPr>
       <w:r>
-        <w:t xml:space="preserve">Este es uno de los errores más frecuentes y difíciles de detectar cuando integras resultados con el diseño de muestreo: la tabla de emplazamientos tiene</w:t>
+        <w:t xml:space="preserve">Este ejercicio muestra la capacidad más útil de</w:t>
+      </w:r>
+      <w:r>
+        <w:t xml:space="preserve"> </w:t>
+      </w:r>
+      <w:r>
+        <w:rPr>
+          <w:rStyle w:val="VerbatimChar"/>
+        </w:rPr>
+        <w:t xml:space="preserve">targets</w:t>
+      </w:r>
+      <w:r>
+        <w:t xml:space="preserve"> </w:t>
+      </w:r>
+      <w:r>
+        <w:t xml:space="preserve">en el día a día: si modificas algo,</w:t>
       </w:r>
       <w:r>
         <w:t xml:space="preserve"> </w:t>
@@ -2641,67 +2718,317 @@
           <w:b/>
           <w:bCs/>
         </w:rPr>
-        <w:t xml:space="preserve">dos filas para el mismo grabador</w:t>
-      </w:r>
-      <w:r>
-        <w:t xml:space="preserve"> </w:t>
-      </w:r>
-      <w:r>
-        <w:t xml:space="preserve">(por una doble clasificación de hábitat, una fila duplicada accidental, o datos de dos técnicos sin reconciliar), y cada grabación de ese grabador se multiplica en la tabla final</w:t>
-      </w:r>
-      <w:r>
-        <w:t xml:space="preserve"> </w:t>
-      </w:r>
+        <w:t xml:space="preserve">solo recalcula lo que depende de ese algo</w:t>
+      </w:r>
+      <w:r>
+        <w:t xml:space="preserve">. El resto se reutiliza de la caché sin ejecutarse de nuevo.</w:t>
+      </w:r>
+    </w:p>
+    <w:p>
+      <w:pPr>
+        <w:pStyle w:val="BodyText"/>
+      </w:pPr>
       <w:r>
         <w:rPr>
           <w:b/>
           <w:bCs/>
         </w:rPr>
-        <w:t xml:space="preserve">sin ningún mensaje de error de R</w:t>
-      </w:r>
-      <w:r>
-        <w:t xml:space="preserve">.</w:t>
-      </w:r>
-    </w:p>
-    <w:p>
-      <w:pPr>
-        <w:pStyle w:val="BodyText"/>
-      </w:pPr>
-      <w:r>
-        <w:t xml:space="preserve">El flujo incluye un guardarraíl que lo detecta. Aquí lo vas a provocar para ver cómo funciona.</w:t>
-      </w:r>
-    </w:p>
-    <w:p>
-      <w:pPr>
-        <w:pStyle w:val="BodyText"/>
+        <w:t xml:space="preserve">Paso 1.</w:t>
+      </w:r>
+      <w:r>
+        <w:t xml:space="preserve"> </w:t>
+      </w:r>
+      <w:r>
+        <w:t xml:space="preserve">Abre</w:t>
+      </w:r>
+      <w:r>
+        <w:t xml:space="preserve"> </w:t>
+      </w:r>
+      <w:r>
+        <w:rPr>
+          <w:rStyle w:val="VerbatimChar"/>
+        </w:rPr>
+        <w:t xml:space="preserve">R/qc.R</w:t>
+      </w:r>
+      <w:r>
+        <w:t xml:space="preserve"> </w:t>
+      </w:r>
+      <w:r>
+        <w:t xml:space="preserve">desde el panel</w:t>
+      </w:r>
+      <w:r>
+        <w:t xml:space="preserve"> </w:t>
+      </w:r>
+      <w:r>
+        <w:rPr>
+          <w:i/>
+          <w:iCs/>
+        </w:rPr>
+        <w:t xml:space="preserve">Files</w:t>
+      </w:r>
+      <w:r>
+        <w:t xml:space="preserve"> </w:t>
+      </w:r>
+      <w:r>
+        <w:t xml:space="preserve">(carpeta</w:t>
+      </w:r>
+      <w:r>
+        <w:t xml:space="preserve"> </w:t>
+      </w:r>
+      <w:r>
+        <w:rPr>
+          <w:rStyle w:val="VerbatimChar"/>
+        </w:rPr>
+        <w:t xml:space="preserve">R/</w:t>
+      </w:r>
+      <w:r>
+        <w:t xml:space="preserve"> </w:t>
+      </w:r>
+      <w:r>
+        <w:t xml:space="preserve">→ archivo</w:t>
+      </w:r>
+      <w:r>
+        <w:t xml:space="preserve"> </w:t>
+      </w:r>
+      <w:r>
+        <w:rPr>
+          <w:rStyle w:val="VerbatimChar"/>
+        </w:rPr>
+        <w:t xml:space="preserve">qc.R</w:t>
+      </w:r>
+      <w:r>
+        <w:t xml:space="preserve">). Localiza la función</w:t>
+      </w:r>
+      <w:r>
+        <w:t xml:space="preserve"> </w:t>
+      </w:r>
+      <w:r>
+        <w:rPr>
+          <w:rStyle w:val="VerbatimChar"/>
+        </w:rPr>
+        <w:t xml:space="preserve">qc_flag()</w:t>
+      </w:r>
+      <w:r>
+        <w:t xml:space="preserve">. La primera línea es:</w:t>
+      </w:r>
+    </w:p>
+    <w:p>
+      <w:pPr>
+        <w:pStyle w:val="SourceCode"/>
+      </w:pPr>
+      <w:r>
+        <w:rPr>
+          <w:rStyle w:val="NormalTok"/>
+        </w:rPr>
+        <w:t xml:space="preserve">qc_flag </w:t>
+      </w:r>
+      <w:r>
+        <w:rPr>
+          <w:rStyle w:val="OtherTok"/>
+        </w:rPr>
+        <w:t xml:space="preserve">&lt;-</w:t>
+      </w:r>
+      <w:r>
+        <w:rPr>
+          <w:rStyle w:val="NormalTok"/>
+        </w:rPr>
+        <w:t xml:space="preserve"> </w:t>
+      </w:r>
+      <w:r>
+        <w:rPr>
+          <w:rStyle w:val="ControlFlowTok"/>
+        </w:rPr>
+        <w:t xml:space="preserve">function</w:t>
+      </w:r>
+      <w:r>
+        <w:rPr>
+          <w:rStyle w:val="NormalTok"/>
+        </w:rPr>
+        <w:t xml:space="preserve">(meta, </w:t>
+      </w:r>
+      <w:r>
+        <w:rPr>
+          <w:rStyle w:val="AttributeTok"/>
+        </w:rPr>
+        <w:t xml:space="preserve">expected_dur_s =</w:t>
+      </w:r>
+      <w:r>
+        <w:rPr>
+          <w:rStyle w:val="NormalTok"/>
+        </w:rPr>
+        <w:t xml:space="preserve"> </w:t>
+      </w:r>
+      <w:r>
+        <w:rPr>
+          <w:rStyle w:val="ConstantTok"/>
+        </w:rPr>
+        <w:t xml:space="preserve">NULL</w:t>
+      </w:r>
+      <w:r>
+        <w:rPr>
+          <w:rStyle w:val="NormalTok"/>
+        </w:rPr>
+        <w:t xml:space="preserve">, </w:t>
+      </w:r>
+      <w:r>
+        <w:rPr>
+          <w:rStyle w:val="AttributeTok"/>
+        </w:rPr>
+        <w:t xml:space="preserve">tol_frac =</w:t>
+      </w:r>
+      <w:r>
+        <w:rPr>
+          <w:rStyle w:val="NormalTok"/>
+        </w:rPr>
+        <w:t xml:space="preserve"> </w:t>
+      </w:r>
+      <w:r>
+        <w:rPr>
+          <w:rStyle w:val="FloatTok"/>
+        </w:rPr>
+        <w:t xml:space="preserve">0.05</w:t>
+      </w:r>
+      <w:r>
+        <w:rPr>
+          <w:rStyle w:val="NormalTok"/>
+        </w:rPr>
+        <w:t xml:space="preserve">) {</w:t>
+      </w:r>
+    </w:p>
+    <w:p>
+      <w:pPr>
+        <w:pStyle w:val="FirstParagraph"/>
+      </w:pPr>
+      <w:r>
+        <w:t xml:space="preserve">El parámetro</w:t>
+      </w:r>
+      <w:r>
+        <w:t xml:space="preserve"> </w:t>
+      </w:r>
+      <w:r>
+        <w:rPr>
+          <w:rStyle w:val="VerbatimChar"/>
+        </w:rPr>
+        <w:t xml:space="preserve">tol_frac = 0.05</w:t>
+      </w:r>
+      <w:r>
+        <w:t xml:space="preserve"> </w:t>
+      </w:r>
+      <w:r>
+        <w:t xml:space="preserve">significa que se descartan las grabaciones con una duración que se desvíe más del 5 % de lo esperado. Cámbialo a 0.75:</w:t>
+      </w:r>
+    </w:p>
+    <w:p>
+      <w:pPr>
+        <w:pStyle w:val="SourceCode"/>
+      </w:pPr>
+      <w:r>
+        <w:rPr>
+          <w:rStyle w:val="NormalTok"/>
+        </w:rPr>
+        <w:t xml:space="preserve">qc_flag </w:t>
+      </w:r>
+      <w:r>
+        <w:rPr>
+          <w:rStyle w:val="OtherTok"/>
+        </w:rPr>
+        <w:t xml:space="preserve">&lt;-</w:t>
+      </w:r>
+      <w:r>
+        <w:rPr>
+          <w:rStyle w:val="NormalTok"/>
+        </w:rPr>
+        <w:t xml:space="preserve"> </w:t>
+      </w:r>
+      <w:r>
+        <w:rPr>
+          <w:rStyle w:val="ControlFlowTok"/>
+        </w:rPr>
+        <w:t xml:space="preserve">function</w:t>
+      </w:r>
+      <w:r>
+        <w:rPr>
+          <w:rStyle w:val="NormalTok"/>
+        </w:rPr>
+        <w:t xml:space="preserve">(meta, </w:t>
+      </w:r>
+      <w:r>
+        <w:rPr>
+          <w:rStyle w:val="AttributeTok"/>
+        </w:rPr>
+        <w:t xml:space="preserve">expected_dur_s =</w:t>
+      </w:r>
+      <w:r>
+        <w:rPr>
+          <w:rStyle w:val="NormalTok"/>
+        </w:rPr>
+        <w:t xml:space="preserve"> </w:t>
+      </w:r>
+      <w:r>
+        <w:rPr>
+          <w:rStyle w:val="ConstantTok"/>
+        </w:rPr>
+        <w:t xml:space="preserve">NULL</w:t>
+      </w:r>
+      <w:r>
+        <w:rPr>
+          <w:rStyle w:val="NormalTok"/>
+        </w:rPr>
+        <w:t xml:space="preserve">, </w:t>
+      </w:r>
+      <w:r>
+        <w:rPr>
+          <w:rStyle w:val="AttributeTok"/>
+        </w:rPr>
+        <w:t xml:space="preserve">tol_frac =</w:t>
+      </w:r>
+      <w:r>
+        <w:rPr>
+          <w:rStyle w:val="NormalTok"/>
+        </w:rPr>
+        <w:t xml:space="preserve"> </w:t>
+      </w:r>
+      <w:r>
+        <w:rPr>
+          <w:rStyle w:val="FloatTok"/>
+        </w:rPr>
+        <w:t xml:space="preserve">0.75</w:t>
+      </w:r>
+      <w:r>
+        <w:rPr>
+          <w:rStyle w:val="NormalTok"/>
+        </w:rPr>
+        <w:t xml:space="preserve">) {</w:t>
+      </w:r>
+    </w:p>
+    <w:p>
+      <w:pPr>
+        <w:pStyle w:val="FirstParagraph"/>
       </w:pPr>
       <w:r>
         <w:rPr>
           <w:b/>
           <w:bCs/>
         </w:rPr>
-        <w:t xml:space="preserve">Paso 1.</w:t>
-      </w:r>
-      <w:r>
-        <w:t xml:space="preserve"> </w:t>
-      </w:r>
-      <w:r>
-        <w:t xml:space="preserve">Abre (o vuelve a)</w:t>
-      </w:r>
-      <w:r>
-        <w:t xml:space="preserve"> </w:t>
-      </w:r>
-      <w:r>
-        <w:rPr>
-          <w:rStyle w:val="VerbatimChar"/>
-        </w:rPr>
-        <w:t xml:space="preserve">_targets.R</w:t>
-      </w:r>
-      <w:r>
-        <w:t xml:space="preserve"> </w:t>
-      </w:r>
-      <w:r>
-        <w:t xml:space="preserve">y localiza la línea:</w:t>
+        <w:t xml:space="preserve">Paso 2.</w:t>
+      </w:r>
+      <w:r>
+        <w:t xml:space="preserve"> </w:t>
+      </w:r>
+      <w:r>
+        <w:t xml:space="preserve">Guarda el archivo (Ctrl+S) y ejecuta el bloque del Ejercicio 4 en</w:t>
+      </w:r>
+      <w:r>
+        <w:t xml:space="preserve"> </w:t>
+      </w:r>
+      <w:r>
+        <w:rPr>
+          <w:rStyle w:val="VerbatimChar"/>
+        </w:rPr>
+        <w:t xml:space="preserve">practica.R</w:t>
+      </w:r>
+      <w:r>
+        <w:t xml:space="preserve">:</w:t>
       </w:r>
     </w:p>
     <w:p>
@@ -2710,112 +3037,27 @@
       </w:pPr>
       <w:r>
         <w:rPr>
+          <w:rStyle w:val="NormalTok"/>
+        </w:rPr>
+        <w:t xml:space="preserve">targets</w:t>
+      </w:r>
+      <w:r>
+        <w:rPr>
+          <w:rStyle w:val="SpecialCharTok"/>
+        </w:rPr>
+        <w:t xml:space="preserve">::</w:t>
+      </w:r>
+      <w:r>
+        <w:rPr>
           <w:rStyle w:val="FunctionTok"/>
         </w:rPr>
-        <w:t xml:space="preserve">tar_target</w:t>
-      </w:r>
-      <w:r>
-        <w:rPr>
-          <w:rStyle w:val="NormalTok"/>
-        </w:rPr>
-        <w:t xml:space="preserve">(sites_file, </w:t>
-      </w:r>
-      <w:r>
-        <w:rPr>
-          <w:rStyle w:val="StringTok"/>
-        </w:rPr>
-        <w:t xml:space="preserve">"data/sites.csv"</w:t>
-      </w:r>
-      <w:r>
-        <w:rPr>
-          <w:rStyle w:val="NormalTok"/>
-        </w:rPr>
-        <w:t xml:space="preserve">, </w:t>
-      </w:r>
-      <w:r>
-        <w:rPr>
-          <w:rStyle w:val="AttributeTok"/>
-        </w:rPr>
-        <w:t xml:space="preserve">format =</w:t>
-      </w:r>
-      <w:r>
-        <w:rPr>
-          <w:rStyle w:val="NormalTok"/>
-        </w:rPr>
-        <w:t xml:space="preserve"> </w:t>
-      </w:r>
-      <w:r>
-        <w:rPr>
-          <w:rStyle w:val="StringTok"/>
-        </w:rPr>
-        <w:t xml:space="preserve">"file"</w:t>
-      </w:r>
-      <w:r>
-        <w:rPr>
-          <w:rStyle w:val="NormalTok"/>
-        </w:rPr>
-        <w:t xml:space="preserve">),</w:t>
-      </w:r>
-    </w:p>
-    <w:p>
-      <w:pPr>
-        <w:pStyle w:val="FirstParagraph"/>
-      </w:pPr>
-      <w:r>
-        <w:t xml:space="preserve">Cámbiala a:</w:t>
-      </w:r>
-    </w:p>
-    <w:p>
-      <w:pPr>
-        <w:pStyle w:val="SourceCode"/>
-      </w:pPr>
-      <w:r>
-        <w:rPr>
-          <w:rStyle w:val="FunctionTok"/>
-        </w:rPr>
-        <w:t xml:space="preserve">tar_target</w:t>
-      </w:r>
-      <w:r>
-        <w:rPr>
-          <w:rStyle w:val="NormalTok"/>
-        </w:rPr>
-        <w:t xml:space="preserve">(sites_file, </w:t>
-      </w:r>
-      <w:r>
-        <w:rPr>
-          <w:rStyle w:val="StringTok"/>
-        </w:rPr>
-        <w:t xml:space="preserve">"data/sites_duplicate.csv"</w:t>
-      </w:r>
-      <w:r>
-        <w:rPr>
-          <w:rStyle w:val="NormalTok"/>
-        </w:rPr>
-        <w:t xml:space="preserve">, </w:t>
-      </w:r>
-      <w:r>
-        <w:rPr>
-          <w:rStyle w:val="AttributeTok"/>
-        </w:rPr>
-        <w:t xml:space="preserve">format =</w:t>
-      </w:r>
-      <w:r>
-        <w:rPr>
-          <w:rStyle w:val="NormalTok"/>
-        </w:rPr>
-        <w:t xml:space="preserve"> </w:t>
-      </w:r>
-      <w:r>
-        <w:rPr>
-          <w:rStyle w:val="StringTok"/>
-        </w:rPr>
-        <w:t xml:space="preserve">"file"</w:t>
-      </w:r>
-      <w:r>
-        <w:rPr>
-          <w:rStyle w:val="NormalTok"/>
-        </w:rPr>
-        <w:t xml:space="preserve">),</w:t>
+        <w:t xml:space="preserve">tar_make</w:t>
+      </w:r>
+      <w:r>
+        <w:rPr>
+          <w:rStyle w:val="NormalTok"/>
+        </w:rPr>
+        <w:t xml:space="preserve">()</w:t>
       </w:r>
     </w:p>
     <w:p>
@@ -2827,25 +3069,28 @@
           <w:b/>
           <w:bCs/>
         </w:rPr>
-        <w:t xml:space="preserve">Paso 2.</w:t>
-      </w:r>
-      <w:r>
-        <w:t xml:space="preserve"> </w:t>
-      </w:r>
-      <w:r>
-        <w:t xml:space="preserve">Guarda y ejecuta el bloque del Ejercicio 4 en</w:t>
-      </w:r>
-      <w:r>
-        <w:t xml:space="preserve"> </w:t>
-      </w:r>
-      <w:r>
-        <w:rPr>
-          <w:rStyle w:val="VerbatimChar"/>
-        </w:rPr>
-        <w:t xml:space="preserve">practica.R</w:t>
-      </w:r>
-      <w:r>
-        <w:t xml:space="preserve">:</w:t>
+        <w:t xml:space="preserve">Lo que verás.</w:t>
+      </w:r>
+      <w:r>
+        <w:t xml:space="preserve"> </w:t>
+      </w:r>
+      <w:r>
+        <w:t xml:space="preserve">En la consola, algunos targets aparecen como</w:t>
+      </w:r>
+      <w:r>
+        <w:t xml:space="preserve"> </w:t>
+      </w:r>
+      <w:r>
+        <w:rPr>
+          <w:rStyle w:val="VerbatimChar"/>
+        </w:rPr>
+        <w:t xml:space="preserve">skip</w:t>
+      </w:r>
+      <w:r>
+        <w:t xml:space="preserve"> </w:t>
+      </w:r>
+      <w:r>
+        <w:t xml:space="preserve">(se reutilizan de la caché) y otros se recalculan. El parseo de los metadatos —la etapa más costosa— no se vuelve a ejecutar. El resultado cambia:</w:t>
       </w:r>
     </w:p>
     <w:p>
@@ -2854,113 +3099,30 @@
       </w:pPr>
       <w:r>
         <w:rPr>
-          <w:rStyle w:val="NormalTok"/>
-        </w:rPr>
-        <w:t xml:space="preserve">targets</w:t>
-      </w:r>
-      <w:r>
-        <w:rPr>
-          <w:rStyle w:val="SpecialCharTok"/>
-        </w:rPr>
-        <w:t xml:space="preserve">::</w:t>
-      </w:r>
-      <w:r>
-        <w:rPr>
-          <w:rStyle w:val="FunctionTok"/>
-        </w:rPr>
-        <w:t xml:space="preserve">tar_make</w:t>
-      </w:r>
-      <w:r>
-        <w:rPr>
-          <w:rStyle w:val="NormalTok"/>
-        </w:rPr>
-        <w:t xml:space="preserve">()</w:t>
+          <w:rStyle w:val="VerbatimChar"/>
+        </w:rPr>
+        <w:t xml:space="preserve">PASAN QC:  6 / 6</w:t>
       </w:r>
     </w:p>
     <w:p>
       <w:pPr>
         <w:pStyle w:val="FirstParagraph"/>
       </w:pPr>
+      <w:r>
+        <w:t xml:space="preserve">La tabla tiene ahora</w:t>
+      </w:r>
+      <w:r>
+        <w:t xml:space="preserve"> </w:t>
+      </w:r>
       <w:r>
         <w:rPr>
           <w:b/>
           <w:bCs/>
         </w:rPr>
-        <w:t xml:space="preserve">Lo que verás.</w:t>
-      </w:r>
-      <w:r>
-        <w:t xml:space="preserve"> </w:t>
-      </w:r>
-      <w:r>
-        <w:t xml:space="preserve">Dos avisos en la consola:</w:t>
-      </w:r>
-    </w:p>
-    <w:p>
-      <w:pPr>
-        <w:pStyle w:val="SourceCode"/>
-      </w:pPr>
-      <w:r>
-        <w:rPr>
-          <w:rStyle w:val="VerbatimChar"/>
-        </w:rPr>
-        <w:t xml:space="preserve">Detected an unexpected many-to-many relationship between `x` and `y`.</w:t>
-      </w:r>
-      <w:r>
-        <w:br/>
-      </w:r>
-      <w:r>
-        <w:rPr>
-          <w:rStyle w:val="VerbatimChar"/>
-        </w:rPr>
-        <w:t xml:space="preserve">El join cambió el nº de filas (5 -&gt; 7). Revisa claves duplicadas en 'sites' o 'meta'.</w:t>
-      </w:r>
-    </w:p>
-    <w:p>
-      <w:pPr>
-        <w:pStyle w:val="FirstParagraph"/>
-      </w:pPr>
-      <w:r>
-        <w:t xml:space="preserve">La tabla tiene</w:t>
-      </w:r>
-      <w:r>
-        <w:t xml:space="preserve"> </w:t>
-      </w:r>
-      <w:r>
-        <w:rPr>
-          <w:b/>
-          <w:bCs/>
-        </w:rPr>
-        <w:t xml:space="preserve">7 filas en lugar de 5</w:t>
-      </w:r>
-      <w:r>
-        <w:t xml:space="preserve">. Las grabaciones del grabador AM02 aparecen duplicadas: una fila con hábitat</w:t>
-      </w:r>
-      <w:r>
-        <w:t xml:space="preserve"> </w:t>
-      </w:r>
-      <w:r>
-        <w:rPr>
-          <w:rStyle w:val="VerbatimChar"/>
-        </w:rPr>
-        <w:t xml:space="preserve">matorral</w:t>
-      </w:r>
-      <w:r>
-        <w:t xml:space="preserve"> </w:t>
-      </w:r>
-      <w:r>
-        <w:t xml:space="preserve">y otra con</w:t>
-      </w:r>
-      <w:r>
-        <w:t xml:space="preserve"> </w:t>
-      </w:r>
-      <w:r>
-        <w:rPr>
-          <w:rStyle w:val="VerbatimChar"/>
-        </w:rPr>
-        <w:t xml:space="preserve">pastizal</w:t>
-      </w:r>
-      <w:r>
-        <w:t xml:space="preserve">. Los índices acústicos y las fechas son correctos en las dos filas; el error solo se ve en el número de filas.</w:t>
+        <w:t xml:space="preserve">6 filas</w:t>
+      </w:r>
+      <w:r>
+        <w:t xml:space="preserve">: la grabación truncada ya no se descarta porque el umbral es ahora mucho más permisivo.</w:t>
       </w:r>
     </w:p>
     <w:p>
@@ -2968,186 +3130,12 @@
         <w:pStyle w:val="BodyText"/>
       </w:pPr>
       <w:r>
-        <w:t xml:space="preserve">Para encontrar qué fila está duplicada:</w:t>
-      </w:r>
-    </w:p>
-    <w:p>
-      <w:pPr>
-        <w:pStyle w:val="SourceCode"/>
-      </w:pPr>
-      <w:r>
-        <w:rPr>
-          <w:rStyle w:val="NormalTok"/>
-        </w:rPr>
-        <w:t xml:space="preserve">sites_dup </w:t>
-      </w:r>
-      <w:r>
-        <w:rPr>
-          <w:rStyle w:val="OtherTok"/>
-        </w:rPr>
-        <w:t xml:space="preserve">&lt;-</w:t>
-      </w:r>
-      <w:r>
-        <w:rPr>
-          <w:rStyle w:val="NormalTok"/>
-        </w:rPr>
-        <w:t xml:space="preserve"> </w:t>
-      </w:r>
-      <w:r>
-        <w:rPr>
-          <w:rStyle w:val="FunctionTok"/>
-        </w:rPr>
-        <w:t xml:space="preserve">read.csv</w:t>
-      </w:r>
-      <w:r>
-        <w:rPr>
-          <w:rStyle w:val="NormalTok"/>
-        </w:rPr>
-        <w:t xml:space="preserve">(</w:t>
-      </w:r>
-      <w:r>
-        <w:rPr>
-          <w:rStyle w:val="StringTok"/>
-        </w:rPr>
-        <w:t xml:space="preserve">"data/sites_duplicate.csv"</w:t>
-      </w:r>
-      <w:r>
-        <w:rPr>
-          <w:rStyle w:val="NormalTok"/>
-        </w:rPr>
-        <w:t xml:space="preserve">)</w:t>
-      </w:r>
-      <w:r>
-        <w:br/>
-      </w:r>
-      <w:r>
-        <w:rPr>
-          <w:rStyle w:val="NormalTok"/>
-        </w:rPr>
-        <w:t xml:space="preserve">sites_dup[</w:t>
-      </w:r>
-      <w:r>
-        <w:rPr>
-          <w:rStyle w:val="FunctionTok"/>
-        </w:rPr>
-        <w:t xml:space="preserve">duplicated</w:t>
-      </w:r>
-      <w:r>
-        <w:rPr>
-          <w:rStyle w:val="NormalTok"/>
-        </w:rPr>
-        <w:t xml:space="preserve">(sites_dup</w:t>
-      </w:r>
-      <w:r>
-        <w:rPr>
-          <w:rStyle w:val="SpecialCharTok"/>
-        </w:rPr>
-        <w:t xml:space="preserve">$</w:t>
-      </w:r>
-      <w:r>
-        <w:rPr>
-          <w:rStyle w:val="NormalTok"/>
-        </w:rPr>
-        <w:t xml:space="preserve">recorder_id), ]</w:t>
-      </w:r>
-    </w:p>
-    <w:p>
-      <w:pPr>
-        <w:pStyle w:val="FirstParagraph"/>
-      </w:pPr>
-      <w:r>
-        <w:t xml:space="preserve">Si el aviso no aparece,</w:t>
-      </w:r>
-      <w:r>
-        <w:t xml:space="preserve"> </w:t>
-      </w:r>
-      <w:r>
-        <w:rPr>
-          <w:rStyle w:val="VerbatimChar"/>
-        </w:rPr>
-        <w:t xml:space="preserve">targets</w:t>
-      </w:r>
-      <w:r>
-        <w:t xml:space="preserve"> </w:t>
-      </w:r>
-      <w:r>
-        <w:t xml:space="preserve">puede haber reutilizado</w:t>
-      </w:r>
-      <w:r>
-        <w:t xml:space="preserve"> </w:t>
-      </w:r>
-      <w:r>
-        <w:rPr>
-          <w:rStyle w:val="VerbatimChar"/>
-        </w:rPr>
-        <w:t xml:space="preserve">final_table</w:t>
-      </w:r>
-      <w:r>
-        <w:t xml:space="preserve"> </w:t>
-      </w:r>
-      <w:r>
-        <w:t xml:space="preserve">de la caché. Ejecuta esto y repite:</w:t>
-      </w:r>
-    </w:p>
-    <w:p>
-      <w:pPr>
-        <w:pStyle w:val="SourceCode"/>
-      </w:pPr>
-      <w:r>
-        <w:rPr>
-          <w:rStyle w:val="NormalTok"/>
-        </w:rPr>
-        <w:t xml:space="preserve">targets</w:t>
-      </w:r>
-      <w:r>
-        <w:rPr>
-          <w:rStyle w:val="SpecialCharTok"/>
-        </w:rPr>
-        <w:t xml:space="preserve">::</w:t>
-      </w:r>
-      <w:r>
-        <w:rPr>
-          <w:rStyle w:val="FunctionTok"/>
-        </w:rPr>
-        <w:t xml:space="preserve">tar_invalidate</w:t>
-      </w:r>
-      <w:r>
-        <w:rPr>
-          <w:rStyle w:val="NormalTok"/>
-        </w:rPr>
-        <w:t xml:space="preserve">(final_table)</w:t>
-      </w:r>
-      <w:r>
-        <w:br/>
-      </w:r>
-      <w:r>
-        <w:rPr>
-          <w:rStyle w:val="NormalTok"/>
-        </w:rPr>
-        <w:t xml:space="preserve">targets</w:t>
-      </w:r>
-      <w:r>
-        <w:rPr>
-          <w:rStyle w:val="SpecialCharTok"/>
-        </w:rPr>
-        <w:t xml:space="preserve">::</w:t>
-      </w:r>
-      <w:r>
-        <w:rPr>
-          <w:rStyle w:val="FunctionTok"/>
-        </w:rPr>
-        <w:t xml:space="preserve">tar_make</w:t>
-      </w:r>
-      <w:r>
-        <w:rPr>
-          <w:rStyle w:val="NormalTok"/>
-        </w:rPr>
-        <w:t xml:space="preserve">()</w:t>
-      </w:r>
-    </w:p>
-    <w:p>
-      <w:pPr>
-        <w:pStyle w:val="FirstParagraph"/>
+        <w:t xml:space="preserve">Un umbral de 0.75 significa que se aceptan grabaciones con hasta el 75 % de duración anómala. ¿Tiene sentido para tu proyecto? Eso es una decisión ecológica, no técnica.</w:t>
+      </w:r>
+    </w:p>
+    <w:p>
+      <w:pPr>
+        <w:pStyle w:val="BodyText"/>
       </w:pPr>
       <w:r>
         <w:rPr>
@@ -3169,7 +3157,7 @@
         <w:rPr>
           <w:rStyle w:val="VerbatimChar"/>
         </w:rPr>
-        <w:t xml:space="preserve">"data/sites.csv"</w:t>
+        <w:t xml:space="preserve">tol_frac = 0.05</w:t>
       </w:r>
       <w:r>
         <w:t xml:space="preserve">, guarda y ejecuta</w:t>
@@ -3184,7 +3172,19 @@
         <w:t xml:space="preserve">tar_make()</w:t>
       </w:r>
       <w:r>
-        <w:t xml:space="preserve">. La tabla vuelve a 5 filas.</w:t>
+        <w:t xml:space="preserve">. Vuelves a</w:t>
+      </w:r>
+      <w:r>
+        <w:t xml:space="preserve"> </w:t>
+      </w:r>
+      <w:r>
+        <w:rPr>
+          <w:rStyle w:val="VerbatimChar"/>
+        </w:rPr>
+        <w:t xml:space="preserve">PASAN QC: 5 / 6</w:t>
+      </w:r>
+      <w:r>
+        <w:t xml:space="preserve">.</w:t>
       </w:r>
     </w:p>
     <w:p>
@@ -3417,7 +3417,7 @@
               <w:pStyle w:val="Compact"/>
             </w:pPr>
             <w:r>
-              <w:t xml:space="preserve">El Ejercicio 4 no produce aviso del join</w:t>
+              <w:t xml:space="preserve">El Ejercicio 3 no produce aviso del join</w:t>
             </w:r>
           </w:p>
         </w:tc>
@@ -4906,7 +4906,7 @@
       <w:color w:themeColor="accent1" w:themeShade="BF" w:val="365F91"/>
     </w:rPr>
   </w:style>
-  <w:style w:customStyle="1" w:styleId="SourceCode" w:type="paragraph">
+  <w:style w:type="paragraph" w:customStyle="1" w:styleId="SourceCode">
     <w:name w:val="Source Code"/>
     <w:basedOn w:val="Normal"/>
     <w:link w:val="VerbatimChar"/>
@@ -4914,7 +4914,7 @@
       <w:wordWrap w:val="off"/>
     </w:pPr>
   </w:style>
-  <w:style w:customStyle="1" w:styleId="KeywordTok" w:type="character">
+  <w:style w:type="character" w:customStyle="1" w:styleId="KeywordTok">
     <w:name w:val="KeywordTok"/>
     <w:basedOn w:val="VerbatimChar"/>
     <w:rPr>
@@ -4922,77 +4922,77 @@
       <w:color w:val="007020"/>
     </w:rPr>
   </w:style>
-  <w:style w:customStyle="1" w:styleId="DataTypeTok" w:type="character">
+  <w:style w:type="character" w:customStyle="1" w:styleId="DataTypeTok">
     <w:name w:val="DataTypeTok"/>
     <w:basedOn w:val="VerbatimChar"/>
     <w:rPr>
       <w:color w:val="902000"/>
     </w:rPr>
   </w:style>
-  <w:style w:customStyle="1" w:styleId="DecValTok" w:type="character">
+  <w:style w:type="character" w:customStyle="1" w:styleId="DecValTok">
     <w:name w:val="DecValTok"/>
     <w:basedOn w:val="VerbatimChar"/>
     <w:rPr>
       <w:color w:val="40a070"/>
     </w:rPr>
   </w:style>
-  <w:style w:customStyle="1" w:styleId="BaseNTok" w:type="character">
+  <w:style w:type="character" w:customStyle="1" w:styleId="BaseNTok">
     <w:name w:val="BaseNTok"/>
     <w:basedOn w:val="VerbatimChar"/>
     <w:rPr>
       <w:color w:val="40a070"/>
     </w:rPr>
   </w:style>
-  <w:style w:customStyle="1" w:styleId="FloatTok" w:type="character">
+  <w:style w:type="character" w:customStyle="1" w:styleId="FloatTok">
     <w:name w:val="FloatTok"/>
     <w:basedOn w:val="VerbatimChar"/>
     <w:rPr>
       <w:color w:val="40a070"/>
     </w:rPr>
   </w:style>
-  <w:style w:customStyle="1" w:styleId="ConstantTok" w:type="character">
+  <w:style w:type="character" w:customStyle="1" w:styleId="ConstantTok">
     <w:name w:val="ConstantTok"/>
     <w:basedOn w:val="VerbatimChar"/>
     <w:rPr>
       <w:color w:val="880000"/>
     </w:rPr>
   </w:style>
-  <w:style w:customStyle="1" w:styleId="CharTok" w:type="character">
+  <w:style w:type="character" w:customStyle="1" w:styleId="CharTok">
     <w:name w:val="CharTok"/>
     <w:basedOn w:val="VerbatimChar"/>
     <w:rPr>
       <w:color w:val="4070a0"/>
     </w:rPr>
   </w:style>
-  <w:style w:customStyle="1" w:styleId="SpecialCharTok" w:type="character">
+  <w:style w:type="character" w:customStyle="1" w:styleId="SpecialCharTok">
     <w:name w:val="SpecialCharTok"/>
     <w:basedOn w:val="VerbatimChar"/>
     <w:rPr>
       <w:color w:val="4070a0"/>
     </w:rPr>
   </w:style>
-  <w:style w:customStyle="1" w:styleId="StringTok" w:type="character">
+  <w:style w:type="character" w:customStyle="1" w:styleId="StringTok">
     <w:name w:val="StringTok"/>
     <w:basedOn w:val="VerbatimChar"/>
     <w:rPr>
       <w:color w:val="4070a0"/>
     </w:rPr>
   </w:style>
-  <w:style w:customStyle="1" w:styleId="VerbatimStringTok" w:type="character">
+  <w:style w:type="character" w:customStyle="1" w:styleId="VerbatimStringTok">
     <w:name w:val="VerbatimStringTok"/>
     <w:basedOn w:val="VerbatimChar"/>
     <w:rPr>
       <w:color w:val="4070a0"/>
     </w:rPr>
   </w:style>
-  <w:style w:customStyle="1" w:styleId="SpecialStringTok" w:type="character">
+  <w:style w:type="character" w:customStyle="1" w:styleId="SpecialStringTok">
     <w:name w:val="SpecialStringTok"/>
     <w:basedOn w:val="VerbatimChar"/>
     <w:rPr>
       <w:color w:val="bb6688"/>
     </w:rPr>
   </w:style>
-  <w:style w:customStyle="1" w:styleId="ImportTok" w:type="character">
+  <w:style w:type="character" w:customStyle="1" w:styleId="ImportTok">
     <w:name w:val="ImportTok"/>
     <w:basedOn w:val="VerbatimChar"/>
     <w:rPr>
@@ -5000,7 +5000,7 @@
       <w:color w:val="008000"/>
     </w:rPr>
   </w:style>
-  <w:style w:customStyle="1" w:styleId="CommentTok" w:type="character">
+  <w:style w:type="character" w:customStyle="1" w:styleId="CommentTok">
     <w:name w:val="CommentTok"/>
     <w:basedOn w:val="VerbatimChar"/>
     <w:rPr>
@@ -5008,7 +5008,7 @@
       <w:color w:val="60a0b0"/>
     </w:rPr>
   </w:style>
-  <w:style w:customStyle="1" w:styleId="DocumentationTok" w:type="character">
+  <w:style w:type="character" w:customStyle="1" w:styleId="DocumentationTok">
     <w:name w:val="DocumentationTok"/>
     <w:basedOn w:val="VerbatimChar"/>
     <w:rPr>
@@ -5016,7 +5016,7 @@
       <w:color w:val="ba2121"/>
     </w:rPr>
   </w:style>
-  <w:style w:customStyle="1" w:styleId="AnnotationTok" w:type="character">
+  <w:style w:type="character" w:customStyle="1" w:styleId="AnnotationTok">
     <w:name w:val="AnnotationTok"/>
     <w:basedOn w:val="VerbatimChar"/>
     <w:rPr>
@@ -5025,7 +5025,7 @@
       <w:color w:val="60a0b0"/>
     </w:rPr>
   </w:style>
-  <w:style w:customStyle="1" w:styleId="CommentVarTok" w:type="character">
+  <w:style w:type="character" w:customStyle="1" w:styleId="CommentVarTok">
     <w:name w:val="CommentVarTok"/>
     <w:basedOn w:val="VerbatimChar"/>
     <w:rPr>
@@ -5034,28 +5034,28 @@
       <w:color w:val="60a0b0"/>
     </w:rPr>
   </w:style>
-  <w:style w:customStyle="1" w:styleId="OtherTok" w:type="character">
+  <w:style w:type="character" w:customStyle="1" w:styleId="OtherTok">
     <w:name w:val="OtherTok"/>
     <w:basedOn w:val="VerbatimChar"/>
     <w:rPr>
       <w:color w:val="007020"/>
     </w:rPr>
   </w:style>
-  <w:style w:customStyle="1" w:styleId="FunctionTok" w:type="character">
+  <w:style w:type="character" w:customStyle="1" w:styleId="FunctionTok">
     <w:name w:val="FunctionTok"/>
     <w:basedOn w:val="VerbatimChar"/>
     <w:rPr>
       <w:color w:val="06287e"/>
     </w:rPr>
   </w:style>
-  <w:style w:customStyle="1" w:styleId="VariableTok" w:type="character">
+  <w:style w:type="character" w:customStyle="1" w:styleId="VariableTok">
     <w:name w:val="VariableTok"/>
     <w:basedOn w:val="VerbatimChar"/>
     <w:rPr>
       <w:color w:val="19177c"/>
     </w:rPr>
   </w:style>
-  <w:style w:customStyle="1" w:styleId="ControlFlowTok" w:type="character">
+  <w:style w:type="character" w:customStyle="1" w:styleId="ControlFlowTok">
     <w:name w:val="ControlFlowTok"/>
     <w:basedOn w:val="VerbatimChar"/>
     <w:rPr>
@@ -5063,45 +5063,45 @@
       <w:color w:val="007020"/>
     </w:rPr>
   </w:style>
-  <w:style w:customStyle="1" w:styleId="OperatorTok" w:type="character">
+  <w:style w:type="character" w:customStyle="1" w:styleId="OperatorTok">
     <w:name w:val="OperatorTok"/>
     <w:basedOn w:val="VerbatimChar"/>
     <w:rPr>
       <w:color w:val="666666"/>
     </w:rPr>
   </w:style>
-  <w:style w:customStyle="1" w:styleId="BuiltInTok" w:type="character">
+  <w:style w:type="character" w:customStyle="1" w:styleId="BuiltInTok">
     <w:name w:val="BuiltInTok"/>
     <w:basedOn w:val="VerbatimChar"/>
     <w:rPr>
       <w:color w:val="008000"/>
     </w:rPr>
   </w:style>
-  <w:style w:customStyle="1" w:styleId="ExtensionTok" w:type="character">
+  <w:style w:type="character" w:customStyle="1" w:styleId="ExtensionTok">
     <w:name w:val="ExtensionTok"/>
     <w:basedOn w:val="VerbatimChar"/>
     <w:rPr/>
   </w:style>
-  <w:style w:customStyle="1" w:styleId="PreprocessorTok" w:type="character">
+  <w:style w:type="character" w:customStyle="1" w:styleId="PreprocessorTok">
     <w:name w:val="PreprocessorTok"/>
     <w:basedOn w:val="VerbatimChar"/>
     <w:rPr>
       <w:color w:val="bc7a00"/>
     </w:rPr>
   </w:style>
-  <w:style w:customStyle="1" w:styleId="AttributeTok" w:type="character">
+  <w:style w:type="character" w:customStyle="1" w:styleId="AttributeTok">
     <w:name w:val="AttributeTok"/>
     <w:basedOn w:val="VerbatimChar"/>
     <w:rPr>
       <w:color w:val="7d9029"/>
     </w:rPr>
   </w:style>
-  <w:style w:customStyle="1" w:styleId="RegionMarkerTok" w:type="character">
+  <w:style w:type="character" w:customStyle="1" w:styleId="RegionMarkerTok">
     <w:name w:val="RegionMarkerTok"/>
     <w:basedOn w:val="VerbatimChar"/>
     <w:rPr/>
   </w:style>
-  <w:style w:customStyle="1" w:styleId="InformationTok" w:type="character">
+  <w:style w:type="character" w:customStyle="1" w:styleId="InformationTok">
     <w:name w:val="InformationTok"/>
     <w:basedOn w:val="VerbatimChar"/>
     <w:rPr>
@@ -5110,7 +5110,7 @@
       <w:color w:val="60a0b0"/>
     </w:rPr>
   </w:style>
-  <w:style w:customStyle="1" w:styleId="WarningTok" w:type="character">
+  <w:style w:type="character" w:customStyle="1" w:styleId="WarningTok">
     <w:name w:val="WarningTok"/>
     <w:basedOn w:val="VerbatimChar"/>
     <w:rPr>
@@ -5119,7 +5119,7 @@
       <w:color w:val="60a0b0"/>
     </w:rPr>
   </w:style>
-  <w:style w:customStyle="1" w:styleId="AlertTok" w:type="character">
+  <w:style w:type="character" w:customStyle="1" w:styleId="AlertTok">
     <w:name w:val="AlertTok"/>
     <w:basedOn w:val="VerbatimChar"/>
     <w:rPr>
@@ -5127,7 +5127,7 @@
       <w:color w:val="ff0000"/>
     </w:rPr>
   </w:style>
-  <w:style w:customStyle="1" w:styleId="ErrorTok" w:type="character">
+  <w:style w:type="character" w:customStyle="1" w:styleId="ErrorTok">
     <w:name w:val="ErrorTok"/>
     <w:basedOn w:val="VerbatimChar"/>
     <w:rPr>
@@ -5135,7 +5135,7 @@
       <w:color w:val="ff0000"/>
     </w:rPr>
   </w:style>
-  <w:style w:customStyle="1" w:styleId="NormalTok" w:type="character">
+  <w:style w:type="character" w:customStyle="1" w:styleId="NormalTok">
     <w:name w:val="NormalTok"/>
     <w:basedOn w:val="VerbatimChar"/>
     <w:rPr/>

</xml_diff>